<commit_message>
WOrked on SNP500 data
</commit_message>
<xml_diff>
--- a/SARIMA Report.docx
+++ b/SARIMA Report.docx
@@ -1,134 +1,440 @@
 
 <file path=word/document.xml><?xml version="1.0" encoding="utf-8"?>
-<w:document xmlns:wpc="http://schemas.microsoft.com/office/word/2010/wordprocessingCanvas" xmlns:cx="http://schemas.microsoft.com/office/drawing/2014/chartex" xmlns:cx1="http://schemas.microsoft.com/office/drawing/2015/9/8/chartex" xmlns:cx2="http://schemas.microsoft.com/office/drawing/2015/10/21/chartex" xmlns:cx3="http://schemas.microsoft.com/office/drawing/2016/5/9/chartex" xmlns:cx4="http://schemas.microsoft.com/office/drawing/2016/5/10/chartex" xmlns:cx5="http://schemas.microsoft.com/office/drawing/2016/5/11/chartex" xmlns:cx6="http://schemas.microsoft.com/office/drawing/2016/5/12/chartex" xmlns:cx7="http://schemas.microsoft.com/office/drawing/2016/5/13/chartex" xmlns:cx8="http://schemas.microsoft.com/office/drawing/2016/5/14/chartex" xmlns:mc="http://schemas.openxmlformats.org/markup-compatibility/2006" xmlns:aink="http://schemas.microsoft.com/office/drawing/2016/ink" xmlns:am3d="http://schemas.microsoft.com/office/drawing/2017/model3d" xmlns:o="urn:schemas-microsoft-com:office:office" xmlns:oel="http://schemas.microsoft.com/office/2019/extlst" xmlns:r="http://schemas.openxmlformats.org/officeDocument/2006/relationships" xmlns:m="http://schemas.openxmlformats.org/officeDocument/2006/math" xmlns:v="urn:schemas-microsoft-com:vml" xmlns:wp14="http://schemas.microsoft.com/office/word/2010/wordprocessingDrawing" xmlns:wp="http://schemas.openxmlformats.org/drawingml/2006/wordprocessingDrawing" xmlns:w10="urn:schemas-microsoft-com:office:word" xmlns:w="http://schemas.openxmlformats.org/wordprocessingml/2006/main" xmlns:w14="http://schemas.microsoft.com/office/word/2010/wordml" xmlns:w15="http://schemas.microsoft.com/office/word/2012/wordml" xmlns:w16cex="http://schemas.microsoft.com/office/word/2018/wordml/cex" xmlns:w16cid="http://schemas.microsoft.com/office/word/2016/wordml/cid" xmlns:w16="http://schemas.microsoft.com/office/word/2018/wordml" xmlns:w16sdtdh="http://schemas.microsoft.com/office/word/2020/wordml/sdtdatahash" xmlns:w16se="http://schemas.microsoft.com/office/word/2015/wordml/symex" xmlns:wpg="http://schemas.microsoft.com/office/word/2010/wordprocessingGroup" xmlns:wpi="http://schemas.microsoft.com/office/word/2010/wordprocessingInk" xmlns:wne="http://schemas.microsoft.com/office/word/2006/wordml" xmlns:wps="http://schemas.microsoft.com/office/word/2010/wordprocessingShape" mc:Ignorable="w14 w15 w16se w16cid w16 w16cex w16sdtdh wp14">
+<w:document xmlns:wpc="http://schemas.microsoft.com/office/word/2010/wordprocessingCanvas" xmlns:cx="http://schemas.microsoft.com/office/drawing/2014/chartex" xmlns:cx1="http://schemas.microsoft.com/office/drawing/2015/9/8/chartex" xmlns:cx2="http://schemas.microsoft.com/office/drawing/2015/10/21/chartex" xmlns:cx3="http://schemas.microsoft.com/office/drawing/2016/5/9/chartex" xmlns:cx4="http://schemas.microsoft.com/office/drawing/2016/5/10/chartex" xmlns:cx5="http://schemas.microsoft.com/office/drawing/2016/5/11/chartex" xmlns:cx6="http://schemas.microsoft.com/office/drawing/2016/5/12/chartex" xmlns:cx7="http://schemas.microsoft.com/office/drawing/2016/5/13/chartex" xmlns:cx8="http://schemas.microsoft.com/office/drawing/2016/5/14/chartex" xmlns:mc="http://schemas.openxmlformats.org/markup-compatibility/2006" xmlns:aink="http://schemas.microsoft.com/office/drawing/2016/ink" xmlns:am3d="http://schemas.microsoft.com/office/drawing/2017/model3d" xmlns:o="urn:schemas-microsoft-com:office:office" xmlns:oel="http://schemas.microsoft.com/office/2019/extlst" xmlns:r="http://schemas.openxmlformats.org/officeDocument/2006/relationships" xmlns:m="http://schemas.openxmlformats.org/officeDocument/2006/math" xmlns:v="urn:schemas-microsoft-com:vml" xmlns:wp14="http://schemas.microsoft.com/office/word/2010/wordprocessingDrawing" xmlns:wp="http://schemas.openxmlformats.org/drawingml/2006/wordprocessingDrawing" xmlns:w10="urn:schemas-microsoft-com:office:word" xmlns:w="http://schemas.openxmlformats.org/wordprocessingml/2006/main" xmlns:w14="http://schemas.microsoft.com/office/word/2010/wordml" xmlns:w15="http://schemas.microsoft.com/office/word/2012/wordml" xmlns:w16cex="http://schemas.microsoft.com/office/word/2018/wordml/cex" xmlns:w16cid="http://schemas.microsoft.com/office/word/2016/wordml/cid" xmlns:w16="http://schemas.microsoft.com/office/word/2018/wordml" xmlns:w16du="http://schemas.microsoft.com/office/word/2023/wordml/word16du" xmlns:w16sdtdh="http://schemas.microsoft.com/office/word/2020/wordml/sdtdatahash" xmlns:w16se="http://schemas.microsoft.com/office/word/2015/wordml/symex" xmlns:wpg="http://schemas.microsoft.com/office/word/2010/wordprocessingGroup" xmlns:wpi="http://schemas.microsoft.com/office/word/2010/wordprocessingInk" xmlns:wne="http://schemas.microsoft.com/office/word/2006/wordml" xmlns:wps="http://schemas.microsoft.com/office/word/2010/wordprocessingShape" mc:Ignorable="w14 w15 w16se w16cid w16 w16cex w16sdtdh w16du wp14">
   <w:body>
-    <w:p>
-      <w:pPr>
-        <w:rPr>
-          <w:rFonts w:ascii="Times New Roman" w:hAnsi="Times New Roman" w:cs="Times New Roman"/>
-        </w:rPr>
-      </w:pPr>
-      <w:r>
-        <w:rPr>
-          <w:rFonts w:ascii="Times New Roman" w:hAnsi="Times New Roman" w:cs="Times New Roman"/>
+    <w:sdt>
+      <w:sdtPr>
+        <w:id w:val="452070052"/>
+        <w:docPartObj>
+          <w:docPartGallery w:val="Table of Contents"/>
+          <w:docPartUnique/>
+        </w:docPartObj>
+      </w:sdtPr>
+      <w:sdtEndPr>
+        <w:rPr>
+          <w:rFonts w:asciiTheme="minorHAnsi" w:eastAsiaTheme="minorHAnsi" w:hAnsiTheme="minorHAnsi" w:cstheme="minorBidi"/>
           <w:b/>
           <w:bCs/>
-        </w:rPr>
-        <w:t>Summary</w:t>
-      </w:r>
-      <w:r>
+          <w:noProof/>
+          <w:color w:val="auto"/>
+          <w:kern w:val="2"/>
+          <w:sz w:val="22"/>
+          <w:szCs w:val="22"/>
+          <w14:ligatures w14:val="standardContextual"/>
+        </w:rPr>
+      </w:sdtEndPr>
+      <w:sdtContent>
+        <w:p>
+          <w:pPr>
+            <w:pStyle w:val="TOCHeading"/>
+          </w:pPr>
+        </w:p>
+        <w:p>
+          <w:pPr>
+            <w:rPr>
+              <w:rFonts w:asciiTheme="majorHAnsi" w:eastAsiaTheme="majorEastAsia" w:hAnsiTheme="majorHAnsi" w:cstheme="majorBidi"/>
+              <w:color w:val="2F5496" w:themeColor="accent1" w:themeShade="BF"/>
+              <w:kern w:val="0"/>
+              <w:sz w:val="32"/>
+              <w:szCs w:val="32"/>
+              <w14:ligatures w14:val="none"/>
+            </w:rPr>
+          </w:pPr>
+          <w:r>
+            <w:br w:type="page"/>
+          </w:r>
+        </w:p>
+        <w:p>
+          <w:pPr>
+            <w:pStyle w:val="TOCHeading"/>
+            <w:rPr>
+              <w:rFonts w:ascii="Times New Roman" w:hAnsi="Times New Roman" w:cs="Times New Roman"/>
+              <w:color w:val="auto"/>
+            </w:rPr>
+          </w:pPr>
+          <w:r>
+            <w:rPr>
+              <w:rFonts w:ascii="Times New Roman" w:hAnsi="Times New Roman" w:cs="Times New Roman"/>
+              <w:color w:val="auto"/>
+            </w:rPr>
+            <w:lastRenderedPageBreak/>
+            <w:t>Contents</w:t>
+          </w:r>
+        </w:p>
+        <w:p>
+          <w:pPr>
+            <w:pStyle w:val="TOC1"/>
+            <w:tabs>
+              <w:tab w:val="right" w:leader="dot" w:pos="9350"/>
+            </w:tabs>
+            <w:rPr>
+              <w:rFonts w:ascii="Times New Roman" w:hAnsi="Times New Roman" w:cs="Times New Roman"/>
+              <w:noProof/>
+            </w:rPr>
+          </w:pPr>
+          <w:r>
+            <w:rPr>
+              <w:rFonts w:ascii="Times New Roman" w:hAnsi="Times New Roman" w:cs="Times New Roman"/>
+            </w:rPr>
+            <w:fldChar w:fldCharType="begin"/>
+          </w:r>
+          <w:r>
+            <w:rPr>
+              <w:rFonts w:ascii="Times New Roman" w:hAnsi="Times New Roman" w:cs="Times New Roman"/>
+            </w:rPr>
+            <w:instrText xml:space="preserve"> TOC \o "1-3" \h \z \u </w:instrText>
+          </w:r>
+          <w:r>
+            <w:rPr>
+              <w:rFonts w:ascii="Times New Roman" w:hAnsi="Times New Roman" w:cs="Times New Roman"/>
+            </w:rPr>
+            <w:fldChar w:fldCharType="separate"/>
+          </w:r>
+          <w:hyperlink w:anchor="_Toc239743801" w:history="1">
+            <w:r>
+              <w:rPr>
+                <w:rStyle w:val="Hyperlink"/>
+                <w:rFonts w:ascii="Times New Roman" w:hAnsi="Times New Roman" w:cs="Times New Roman"/>
+                <w:noProof/>
+              </w:rPr>
+              <w:t>Summary</w:t>
+            </w:r>
+            <w:r>
+              <w:rPr>
+                <w:rFonts w:ascii="Times New Roman" w:hAnsi="Times New Roman" w:cs="Times New Roman"/>
+                <w:noProof/>
+                <w:webHidden/>
+              </w:rPr>
+              <w:tab/>
+            </w:r>
+            <w:r>
+              <w:rPr>
+                <w:rFonts w:ascii="Times New Roman" w:hAnsi="Times New Roman" w:cs="Times New Roman"/>
+                <w:noProof/>
+                <w:webHidden/>
+              </w:rPr>
+              <w:fldChar w:fldCharType="begin"/>
+            </w:r>
+            <w:r>
+              <w:rPr>
+                <w:rFonts w:ascii="Times New Roman" w:hAnsi="Times New Roman" w:cs="Times New Roman"/>
+                <w:noProof/>
+                <w:webHidden/>
+              </w:rPr>
+              <w:instrText xml:space="preserve"> PAGEREF _Toc239743801 \h </w:instrText>
+            </w:r>
+            <w:r>
+              <w:rPr>
+                <w:rFonts w:ascii="Times New Roman" w:hAnsi="Times New Roman" w:cs="Times New Roman"/>
+                <w:noProof/>
+                <w:webHidden/>
+              </w:rPr>
+            </w:r>
+            <w:r>
+              <w:rPr>
+                <w:rFonts w:ascii="Times New Roman" w:hAnsi="Times New Roman" w:cs="Times New Roman"/>
+                <w:noProof/>
+                <w:webHidden/>
+              </w:rPr>
+              <w:fldChar w:fldCharType="separate"/>
+            </w:r>
+            <w:r>
+              <w:rPr>
+                <w:rFonts w:ascii="Times New Roman" w:hAnsi="Times New Roman" w:cs="Times New Roman"/>
+                <w:noProof/>
+                <w:webHidden/>
+              </w:rPr>
+              <w:t>1</w:t>
+            </w:r>
+            <w:r>
+              <w:rPr>
+                <w:rFonts w:ascii="Times New Roman" w:hAnsi="Times New Roman" w:cs="Times New Roman"/>
+                <w:noProof/>
+                <w:webHidden/>
+              </w:rPr>
+              <w:fldChar w:fldCharType="end"/>
+            </w:r>
+          </w:hyperlink>
+        </w:p>
+        <w:p>
+          <w:pPr>
+            <w:pStyle w:val="TOC1"/>
+            <w:tabs>
+              <w:tab w:val="right" w:leader="dot" w:pos="9350"/>
+            </w:tabs>
+            <w:rPr>
+              <w:rFonts w:ascii="Times New Roman" w:hAnsi="Times New Roman" w:cs="Times New Roman"/>
+              <w:noProof/>
+            </w:rPr>
+          </w:pPr>
+          <w:hyperlink w:anchor="_Toc239743802" w:history="1">
+            <w:r>
+              <w:rPr>
+                <w:rStyle w:val="Hyperlink"/>
+                <w:rFonts w:ascii="Times New Roman" w:hAnsi="Times New Roman" w:cs="Times New Roman"/>
+                <w:noProof/>
+              </w:rPr>
+              <w:t>Introduction</w:t>
+            </w:r>
+            <w:r>
+              <w:rPr>
+                <w:rFonts w:ascii="Times New Roman" w:hAnsi="Times New Roman" w:cs="Times New Roman"/>
+                <w:noProof/>
+                <w:webHidden/>
+              </w:rPr>
+              <w:tab/>
+            </w:r>
+            <w:r>
+              <w:rPr>
+                <w:rFonts w:ascii="Times New Roman" w:hAnsi="Times New Roman" w:cs="Times New Roman"/>
+                <w:noProof/>
+                <w:webHidden/>
+              </w:rPr>
+              <w:fldChar w:fldCharType="begin"/>
+            </w:r>
+            <w:r>
+              <w:rPr>
+                <w:rFonts w:ascii="Times New Roman" w:hAnsi="Times New Roman" w:cs="Times New Roman"/>
+                <w:noProof/>
+                <w:webHidden/>
+              </w:rPr>
+              <w:instrText xml:space="preserve"> PAGEREF _Toc239743802 \h </w:instrText>
+            </w:r>
+            <w:r>
+              <w:rPr>
+                <w:rFonts w:ascii="Times New Roman" w:hAnsi="Times New Roman" w:cs="Times New Roman"/>
+                <w:noProof/>
+                <w:webHidden/>
+              </w:rPr>
+            </w:r>
+            <w:r>
+              <w:rPr>
+                <w:rFonts w:ascii="Times New Roman" w:hAnsi="Times New Roman" w:cs="Times New Roman"/>
+                <w:noProof/>
+                <w:webHidden/>
+              </w:rPr>
+              <w:fldChar w:fldCharType="separate"/>
+            </w:r>
+            <w:r>
+              <w:rPr>
+                <w:rFonts w:ascii="Times New Roman" w:hAnsi="Times New Roman" w:cs="Times New Roman"/>
+                <w:noProof/>
+                <w:webHidden/>
+              </w:rPr>
+              <w:t>1</w:t>
+            </w:r>
+            <w:r>
+              <w:rPr>
+                <w:rFonts w:ascii="Times New Roman" w:hAnsi="Times New Roman" w:cs="Times New Roman"/>
+                <w:noProof/>
+                <w:webHidden/>
+              </w:rPr>
+              <w:fldChar w:fldCharType="end"/>
+            </w:r>
+          </w:hyperlink>
+        </w:p>
+        <w:p>
+          <w:pPr>
+            <w:pStyle w:val="TOC1"/>
+            <w:tabs>
+              <w:tab w:val="right" w:leader="dot" w:pos="9350"/>
+            </w:tabs>
+            <w:rPr>
+              <w:rFonts w:ascii="Times New Roman" w:hAnsi="Times New Roman" w:cs="Times New Roman"/>
+              <w:noProof/>
+            </w:rPr>
+          </w:pPr>
+          <w:hyperlink w:anchor="_Toc239743803" w:history="1">
+            <w:r>
+              <w:rPr>
+                <w:rStyle w:val="Hyperlink"/>
+                <w:rFonts w:ascii="Times New Roman" w:hAnsi="Times New Roman" w:cs="Times New Roman"/>
+                <w:noProof/>
+              </w:rPr>
+              <w:t>Methodology</w:t>
+            </w:r>
+            <w:r>
+              <w:rPr>
+                <w:rFonts w:ascii="Times New Roman" w:hAnsi="Times New Roman" w:cs="Times New Roman"/>
+                <w:noProof/>
+                <w:webHidden/>
+              </w:rPr>
+              <w:tab/>
+            </w:r>
+            <w:r>
+              <w:rPr>
+                <w:rFonts w:ascii="Times New Roman" w:hAnsi="Times New Roman" w:cs="Times New Roman"/>
+                <w:noProof/>
+                <w:webHidden/>
+              </w:rPr>
+              <w:fldChar w:fldCharType="begin"/>
+            </w:r>
+            <w:r>
+              <w:rPr>
+                <w:rFonts w:ascii="Times New Roman" w:hAnsi="Times New Roman" w:cs="Times New Roman"/>
+                <w:noProof/>
+                <w:webHidden/>
+              </w:rPr>
+              <w:instrText xml:space="preserve"> PAGEREF _Toc239743803 \h </w:instrText>
+            </w:r>
+            <w:r>
+              <w:rPr>
+                <w:rFonts w:ascii="Times New Roman" w:hAnsi="Times New Roman" w:cs="Times New Roman"/>
+                <w:noProof/>
+                <w:webHidden/>
+              </w:rPr>
+            </w:r>
+            <w:r>
+              <w:rPr>
+                <w:rFonts w:ascii="Times New Roman" w:hAnsi="Times New Roman" w:cs="Times New Roman"/>
+                <w:noProof/>
+                <w:webHidden/>
+              </w:rPr>
+              <w:fldChar w:fldCharType="separate"/>
+            </w:r>
+            <w:r>
+              <w:rPr>
+                <w:rFonts w:ascii="Times New Roman" w:hAnsi="Times New Roman" w:cs="Times New Roman"/>
+                <w:noProof/>
+                <w:webHidden/>
+              </w:rPr>
+              <w:t>1</w:t>
+            </w:r>
+            <w:r>
+              <w:rPr>
+                <w:rFonts w:ascii="Times New Roman" w:hAnsi="Times New Roman" w:cs="Times New Roman"/>
+                <w:noProof/>
+                <w:webHidden/>
+              </w:rPr>
+              <w:fldChar w:fldCharType="end"/>
+            </w:r>
+          </w:hyperlink>
+        </w:p>
+        <w:p>
+          <w:pPr>
+            <w:pStyle w:val="TOC1"/>
+            <w:tabs>
+              <w:tab w:val="right" w:leader="dot" w:pos="9350"/>
+            </w:tabs>
+            <w:rPr>
+              <w:rFonts w:ascii="Times New Roman" w:hAnsi="Times New Roman" w:cs="Times New Roman"/>
+              <w:noProof/>
+            </w:rPr>
+          </w:pPr>
+          <w:hyperlink w:anchor="_Toc239743804" w:history="1">
+            <w:r>
+              <w:rPr>
+                <w:rStyle w:val="Hyperlink"/>
+                <w:rFonts w:ascii="Times New Roman" w:hAnsi="Times New Roman" w:cs="Times New Roman"/>
+                <w:noProof/>
+              </w:rPr>
+              <w:t>Results</w:t>
+            </w:r>
+            <w:r>
+              <w:rPr>
+                <w:rFonts w:ascii="Times New Roman" w:hAnsi="Times New Roman" w:cs="Times New Roman"/>
+                <w:noProof/>
+                <w:webHidden/>
+              </w:rPr>
+              <w:tab/>
+            </w:r>
+            <w:r>
+              <w:rPr>
+                <w:rFonts w:ascii="Times New Roman" w:hAnsi="Times New Roman" w:cs="Times New Roman"/>
+                <w:noProof/>
+                <w:webHidden/>
+              </w:rPr>
+              <w:fldChar w:fldCharType="begin"/>
+            </w:r>
+            <w:r>
+              <w:rPr>
+                <w:rFonts w:ascii="Times New Roman" w:hAnsi="Times New Roman" w:cs="Times New Roman"/>
+                <w:noProof/>
+                <w:webHidden/>
+              </w:rPr>
+              <w:instrText xml:space="preserve"> PAGEREF _Toc239743804 \h </w:instrText>
+            </w:r>
+            <w:r>
+              <w:rPr>
+                <w:rFonts w:ascii="Times New Roman" w:hAnsi="Times New Roman" w:cs="Times New Roman"/>
+                <w:noProof/>
+                <w:webHidden/>
+              </w:rPr>
+            </w:r>
+            <w:r>
+              <w:rPr>
+                <w:rFonts w:ascii="Times New Roman" w:hAnsi="Times New Roman" w:cs="Times New Roman"/>
+                <w:noProof/>
+                <w:webHidden/>
+              </w:rPr>
+              <w:fldChar w:fldCharType="separate"/>
+            </w:r>
+            <w:r>
+              <w:rPr>
+                <w:rFonts w:ascii="Times New Roman" w:hAnsi="Times New Roman" w:cs="Times New Roman"/>
+                <w:noProof/>
+                <w:webHidden/>
+              </w:rPr>
+              <w:t>4</w:t>
+            </w:r>
+            <w:r>
+              <w:rPr>
+                <w:rFonts w:ascii="Times New Roman" w:hAnsi="Times New Roman" w:cs="Times New Roman"/>
+                <w:noProof/>
+                <w:webHidden/>
+              </w:rPr>
+              <w:fldChar w:fldCharType="end"/>
+            </w:r>
+          </w:hyperlink>
+        </w:p>
+        <w:p>
+          <w:r>
+            <w:rPr>
+              <w:rFonts w:ascii="Times New Roman" w:hAnsi="Times New Roman" w:cs="Times New Roman"/>
+              <w:b/>
+              <w:bCs/>
+              <w:noProof/>
+            </w:rPr>
+            <w:fldChar w:fldCharType="end"/>
+          </w:r>
+        </w:p>
+      </w:sdtContent>
+    </w:sdt>
+    <w:p>
+      <w:pPr>
+        <w:rPr>
+          <w:rStyle w:val="Heading1Char"/>
+        </w:rPr>
+      </w:pPr>
+      <w:bookmarkStart w:id="0" w:name="_Toc239743801"/>
+      <w:r>
+        <w:rPr>
+          <w:rStyle w:val="Heading1Char"/>
+        </w:rPr>
+        <w:br w:type="page"/>
+      </w:r>
+    </w:p>
+    <w:p>
+      <w:pPr>
+        <w:spacing w:after="0" w:line="360" w:lineRule="auto"/>
         <w:rPr>
           <w:rFonts w:ascii="Times New Roman" w:hAnsi="Times New Roman" w:cs="Times New Roman"/>
           <w:b/>
           <w:bCs/>
         </w:rPr>
-        <w:t xml:space="preserve">: </w:t>
-      </w:r>
-      <w:r>
-        <w:rPr>
-          <w:rFonts w:ascii="Times New Roman" w:hAnsi="Times New Roman" w:cs="Times New Roman"/>
-        </w:rPr>
-        <w:t>The SARIMA</w:t>
-      </w:r>
-      <w:r>
-        <w:rPr>
-          <w:rFonts w:ascii="Times New Roman" w:hAnsi="Times New Roman" w:cs="Times New Roman"/>
-        </w:rPr>
-        <w:t>X</w:t>
-      </w:r>
-      <w:r>
-        <w:rPr>
-          <w:rFonts w:ascii="Times New Roman" w:hAnsi="Times New Roman" w:cs="Times New Roman"/>
-        </w:rPr>
-        <w:t xml:space="preserve"> model and the endogenous variable of water volume did not </w:t>
-      </w:r>
-      <w:r>
-        <w:rPr>
-          <w:rFonts w:ascii="Times New Roman" w:hAnsi="Times New Roman" w:cs="Times New Roman"/>
-        </w:rPr>
-        <w:t xml:space="preserve">fit the data </w:t>
-      </w:r>
-      <w:r>
-        <w:rPr>
-          <w:rFonts w:ascii="Times New Roman" w:hAnsi="Times New Roman" w:cs="Times New Roman"/>
-        </w:rPr>
-        <w:t>properly. Exogenous variables were introduced to explain th</w:t>
-      </w:r>
-      <w:r>
-        <w:rPr>
-          <w:rFonts w:ascii="Times New Roman" w:hAnsi="Times New Roman" w:cs="Times New Roman"/>
-        </w:rPr>
-        <w:t>e model better. After this introduction, the SARIMA</w:t>
-      </w:r>
-      <w:r>
-        <w:rPr>
-          <w:rFonts w:ascii="Times New Roman" w:hAnsi="Times New Roman" w:cs="Times New Roman"/>
-        </w:rPr>
-        <w:t>X</w:t>
-      </w:r>
-      <w:r>
-        <w:rPr>
-          <w:rFonts w:ascii="Times New Roman" w:hAnsi="Times New Roman" w:cs="Times New Roman"/>
-        </w:rPr>
-        <w:t xml:space="preserve"> model </w:t>
-      </w:r>
-      <w:r>
-        <w:rPr>
-          <w:rFonts w:ascii="Times New Roman" w:hAnsi="Times New Roman" w:cs="Times New Roman"/>
-        </w:rPr>
-        <w:t>produced an adjusted r-squared of 61%</w:t>
-      </w:r>
-      <w:r>
-        <w:rPr>
-          <w:rFonts w:ascii="Times New Roman" w:hAnsi="Times New Roman" w:cs="Times New Roman"/>
-        </w:rPr>
-        <w:t xml:space="preserve"> when measuring the data after COVID. The limitations of this model are the evolving economic circumstances </w:t>
-      </w:r>
-      <w:r>
-        <w:rPr>
-          <w:rFonts w:ascii="Times New Roman" w:hAnsi="Times New Roman" w:cs="Times New Roman"/>
-        </w:rPr>
-        <w:t>surrounding oil production in East Texas</w:t>
-      </w:r>
-      <w:r>
-        <w:rPr>
-          <w:rFonts w:ascii="Times New Roman" w:hAnsi="Times New Roman" w:cs="Times New Roman"/>
-        </w:rPr>
-        <w:t xml:space="preserve"> or any other </w:t>
-      </w:r>
-      <w:r>
-        <w:rPr>
-          <w:rFonts w:ascii="Times New Roman" w:hAnsi="Times New Roman" w:cs="Times New Roman"/>
-        </w:rPr>
-        <w:t xml:space="preserve">unexplained or </w:t>
-      </w:r>
-      <w:r>
-        <w:rPr>
-          <w:rFonts w:ascii="Times New Roman" w:hAnsi="Times New Roman" w:cs="Times New Roman"/>
-        </w:rPr>
-        <w:t xml:space="preserve">plausible headache </w:t>
-      </w:r>
-      <w:r>
-        <w:rPr>
-          <w:rFonts w:ascii="Times New Roman" w:hAnsi="Times New Roman" w:cs="Times New Roman"/>
-        </w:rPr>
-        <w:t>regarding</w:t>
-      </w:r>
-      <w:r>
-        <w:rPr>
-          <w:rFonts w:ascii="Times New Roman" w:hAnsi="Times New Roman" w:cs="Times New Roman"/>
-        </w:rPr>
-        <w:t xml:space="preserve"> the disposal </w:t>
-      </w:r>
-      <w:r>
-        <w:rPr>
-          <w:rFonts w:ascii="Times New Roman" w:hAnsi="Times New Roman" w:cs="Times New Roman"/>
-        </w:rPr>
-        <w:t xml:space="preserve">water volume. </w:t>
-      </w:r>
-    </w:p>
-    <w:p>
-      <w:pPr>
+      </w:pPr>
+      <w:r>
+        <w:rPr>
+          <w:rStyle w:val="Heading1Char"/>
+        </w:rPr>
+        <w:lastRenderedPageBreak/>
+        <w:t>Summary</w:t>
+      </w:r>
+      <w:bookmarkEnd w:id="0"/>
+    </w:p>
+    <w:p>
+      <w:pPr>
+        <w:spacing w:after="0" w:line="360" w:lineRule="auto"/>
         <w:rPr>
           <w:rFonts w:ascii="Times New Roman" w:hAnsi="Times New Roman" w:cs="Times New Roman"/>
         </w:rPr>
@@ -139,120 +445,356 @@
           <w:b/>
           <w:bCs/>
         </w:rPr>
-        <w:t>Introduction:</w:t>
-      </w:r>
-      <w:r>
+        <w:t xml:space="preserve"> </w:t>
+      </w:r>
+      <w:r>
+        <w:rPr>
+          <w:rFonts w:ascii="Times New Roman" w:hAnsi="Times New Roman" w:cs="Times New Roman"/>
+        </w:rPr>
+        <w:t>The SARIMA</w:t>
+      </w:r>
+      <w:r>
+        <w:rPr>
+          <w:rFonts w:ascii="Times New Roman" w:hAnsi="Times New Roman" w:cs="Times New Roman"/>
+        </w:rPr>
+        <w:t>X</w:t>
+      </w:r>
+      <w:r>
+        <w:rPr>
+          <w:rFonts w:ascii="Times New Roman" w:hAnsi="Times New Roman" w:cs="Times New Roman"/>
+        </w:rPr>
+        <w:t xml:space="preserve"> model and the endogenous variable of water volume did not </w:t>
+      </w:r>
+      <w:r>
+        <w:rPr>
+          <w:rFonts w:ascii="Times New Roman" w:hAnsi="Times New Roman" w:cs="Times New Roman"/>
+        </w:rPr>
+        <w:t xml:space="preserve">fit the data </w:t>
+      </w:r>
+      <w:r>
+        <w:rPr>
+          <w:rFonts w:ascii="Times New Roman" w:hAnsi="Times New Roman" w:cs="Times New Roman"/>
+        </w:rPr>
+        <w:t>properly. Exogenous variables were introduced to explain th</w:t>
+      </w:r>
+      <w:r>
+        <w:rPr>
+          <w:rFonts w:ascii="Times New Roman" w:hAnsi="Times New Roman" w:cs="Times New Roman"/>
+        </w:rPr>
+        <w:t>e model better. After this introduction, the SARIMA</w:t>
+      </w:r>
+      <w:r>
+        <w:rPr>
+          <w:rFonts w:ascii="Times New Roman" w:hAnsi="Times New Roman" w:cs="Times New Roman"/>
+        </w:rPr>
+        <w:t>X</w:t>
+      </w:r>
+      <w:r>
+        <w:rPr>
+          <w:rFonts w:ascii="Times New Roman" w:hAnsi="Times New Roman" w:cs="Times New Roman"/>
+        </w:rPr>
+        <w:t xml:space="preserve"> model </w:t>
+      </w:r>
+      <w:r>
+        <w:rPr>
+          <w:rFonts w:ascii="Times New Roman" w:hAnsi="Times New Roman" w:cs="Times New Roman"/>
+        </w:rPr>
+        <w:t>produced an adjusted r-squared of 61%</w:t>
+      </w:r>
+      <w:r>
+        <w:rPr>
+          <w:rFonts w:ascii="Times New Roman" w:hAnsi="Times New Roman" w:cs="Times New Roman"/>
+        </w:rPr>
+        <w:t xml:space="preserve"> when measuring the data after COVID. The limitations of this model are the evolving economic circumstances </w:t>
+      </w:r>
+      <w:r>
+        <w:rPr>
+          <w:rFonts w:ascii="Times New Roman" w:hAnsi="Times New Roman" w:cs="Times New Roman"/>
+        </w:rPr>
+        <w:t>surrounding oil production in East Texas</w:t>
+      </w:r>
+      <w:r>
+        <w:rPr>
+          <w:rFonts w:ascii="Times New Roman" w:hAnsi="Times New Roman" w:cs="Times New Roman"/>
+        </w:rPr>
+        <w:t xml:space="preserve"> or any other </w:t>
+      </w:r>
+      <w:r>
+        <w:rPr>
+          <w:rFonts w:ascii="Times New Roman" w:hAnsi="Times New Roman" w:cs="Times New Roman"/>
+        </w:rPr>
+        <w:t xml:space="preserve">unexplained or </w:t>
+      </w:r>
+      <w:r>
+        <w:rPr>
+          <w:rFonts w:ascii="Times New Roman" w:hAnsi="Times New Roman" w:cs="Times New Roman"/>
+        </w:rPr>
+        <w:t xml:space="preserve">plausible headache </w:t>
+      </w:r>
+      <w:r>
+        <w:rPr>
+          <w:rFonts w:ascii="Times New Roman" w:hAnsi="Times New Roman" w:cs="Times New Roman"/>
+        </w:rPr>
+        <w:t>regarding</w:t>
+      </w:r>
+      <w:r>
+        <w:rPr>
+          <w:rFonts w:ascii="Times New Roman" w:hAnsi="Times New Roman" w:cs="Times New Roman"/>
+        </w:rPr>
+        <w:t xml:space="preserve"> the disposal </w:t>
+      </w:r>
+      <w:r>
+        <w:rPr>
+          <w:rFonts w:ascii="Times New Roman" w:hAnsi="Times New Roman" w:cs="Times New Roman"/>
+        </w:rPr>
+        <w:t xml:space="preserve">water volume. </w:t>
+      </w:r>
+    </w:p>
+    <w:p>
+      <w:pPr>
+        <w:spacing w:after="0" w:line="360" w:lineRule="auto"/>
+        <w:rPr>
+          <w:rStyle w:val="Heading1Char"/>
+        </w:rPr>
+      </w:pPr>
+      <w:bookmarkStart w:id="1" w:name="_Toc239743802"/>
+    </w:p>
+    <w:p>
+      <w:pPr>
+        <w:spacing w:after="0" w:line="360" w:lineRule="auto"/>
         <w:rPr>
           <w:rFonts w:ascii="Times New Roman" w:hAnsi="Times New Roman" w:cs="Times New Roman"/>
           <w:b/>
           <w:bCs/>
         </w:rPr>
+      </w:pPr>
+      <w:r>
+        <w:rPr>
+          <w:rStyle w:val="Heading1Char"/>
+        </w:rPr>
+        <w:t>Introduction</w:t>
+      </w:r>
+      <w:bookmarkEnd w:id="1"/>
+    </w:p>
+    <w:p>
+      <w:pPr>
+        <w:spacing w:after="0" w:line="360" w:lineRule="auto"/>
+        <w:rPr>
+          <w:rFonts w:ascii="Times New Roman" w:hAnsi="Times New Roman" w:cs="Times New Roman"/>
+        </w:rPr>
+      </w:pPr>
+      <w:r>
+        <w:rPr>
+          <w:rFonts w:ascii="Times New Roman" w:hAnsi="Times New Roman" w:cs="Times New Roman"/>
+        </w:rPr>
+        <w:t xml:space="preserve">The core issue in this project is finding seasonality in the data. </w:t>
+      </w:r>
+      <w:r>
+        <w:rPr>
+          <w:rFonts w:ascii="Times New Roman" w:hAnsi="Times New Roman" w:cs="Times New Roman"/>
+        </w:rPr>
+        <w:t xml:space="preserve">Saltwater disposal volumes have fluctuated </w:t>
+      </w:r>
+      <w:r>
+        <w:rPr>
+          <w:rFonts w:ascii="Times New Roman" w:hAnsi="Times New Roman" w:cs="Times New Roman"/>
+        </w:rPr>
+        <w:t xml:space="preserve">since the </w:t>
+      </w:r>
+      <w:r>
+        <w:rPr>
+          <w:rFonts w:ascii="Times New Roman" w:hAnsi="Times New Roman" w:cs="Times New Roman"/>
+        </w:rPr>
+        <w:t>beginning</w:t>
+      </w:r>
+      <w:r>
+        <w:rPr>
+          <w:rFonts w:ascii="Times New Roman" w:hAnsi="Times New Roman" w:cs="Times New Roman"/>
+        </w:rPr>
+        <w:t xml:space="preserve"> of the observed data (</w:t>
+      </w:r>
+      <w:r>
+        <w:rPr>
+          <w:rFonts w:ascii="Times New Roman" w:hAnsi="Times New Roman" w:cs="Times New Roman"/>
+        </w:rPr>
+        <w:t>01-01-1998</w:t>
+      </w:r>
+      <w:r>
+        <w:rPr>
+          <w:rFonts w:ascii="Times New Roman" w:hAnsi="Times New Roman" w:cs="Times New Roman"/>
+        </w:rPr>
+        <w:t>)</w:t>
+      </w:r>
+      <w:r>
+        <w:rPr>
+          <w:rFonts w:ascii="Times New Roman" w:hAnsi="Times New Roman" w:cs="Times New Roman"/>
+        </w:rPr>
+        <w:t xml:space="preserve">. </w:t>
+      </w:r>
+      <w:r>
+        <w:rPr>
+          <w:rFonts w:ascii="Times New Roman" w:hAnsi="Times New Roman" w:cs="Times New Roman"/>
+        </w:rPr>
+        <w:t>The data was cleaned and organized into two columns</w:t>
+      </w:r>
+      <w:r>
+        <w:rPr>
+          <w:rFonts w:ascii="Times New Roman" w:hAnsi="Times New Roman" w:cs="Times New Roman"/>
+        </w:rPr>
+        <w:t xml:space="preserve"> (‘Date’, ‘Water Volume’). Date being the observation date</w:t>
+      </w:r>
+      <w:r>
+        <w:rPr>
+          <w:rFonts w:ascii="Times New Roman" w:hAnsi="Times New Roman" w:cs="Times New Roman"/>
+        </w:rPr>
+        <w:t>/month</w:t>
+      </w:r>
+      <w:r>
+        <w:rPr>
+          <w:rFonts w:ascii="Times New Roman" w:hAnsi="Times New Roman" w:cs="Times New Roman"/>
+        </w:rPr>
+        <w:t xml:space="preserve">, and water volume being the </w:t>
+      </w:r>
+      <w:r>
+        <w:rPr>
+          <w:rFonts w:ascii="Times New Roman" w:hAnsi="Times New Roman" w:cs="Times New Roman"/>
+        </w:rPr>
+        <w:t>total saltwater disposal volume of said month.</w:t>
+      </w:r>
+      <w:r>
+        <w:rPr>
+          <w:rFonts w:ascii="Times New Roman" w:hAnsi="Times New Roman" w:cs="Times New Roman"/>
+        </w:rPr>
         <w:t xml:space="preserve"> </w:t>
       </w:r>
-      <w:r>
-        <w:rPr>
-          <w:rFonts w:ascii="Times New Roman" w:hAnsi="Times New Roman" w:cs="Times New Roman"/>
-        </w:rPr>
-        <w:t xml:space="preserve">The core issue in this project is finding seasonality in the data. </w:t>
-      </w:r>
-      <w:r>
-        <w:rPr>
-          <w:rFonts w:ascii="Times New Roman" w:hAnsi="Times New Roman" w:cs="Times New Roman"/>
-        </w:rPr>
-        <w:t xml:space="preserve">Saltwater disposal volumes have fluctuated </w:t>
-      </w:r>
-      <w:r>
-        <w:rPr>
-          <w:rFonts w:ascii="Times New Roman" w:hAnsi="Times New Roman" w:cs="Times New Roman"/>
-        </w:rPr>
-        <w:t xml:space="preserve">since the </w:t>
-      </w:r>
-      <w:r>
-        <w:rPr>
-          <w:rFonts w:ascii="Times New Roman" w:hAnsi="Times New Roman" w:cs="Times New Roman"/>
-        </w:rPr>
-        <w:t>beginning</w:t>
-      </w:r>
-      <w:r>
-        <w:rPr>
-          <w:rFonts w:ascii="Times New Roman" w:hAnsi="Times New Roman" w:cs="Times New Roman"/>
-        </w:rPr>
-        <w:t xml:space="preserve"> of the observed data (</w:t>
-      </w:r>
-      <w:r>
-        <w:rPr>
-          <w:rFonts w:ascii="Times New Roman" w:hAnsi="Times New Roman" w:cs="Times New Roman"/>
-        </w:rPr>
-        <w:t>01-01-1998</w:t>
-      </w:r>
-      <w:r>
-        <w:rPr>
-          <w:rFonts w:ascii="Times New Roman" w:hAnsi="Times New Roman" w:cs="Times New Roman"/>
-        </w:rPr>
-        <w:t>)</w:t>
-      </w:r>
-      <w:r>
-        <w:rPr>
-          <w:rFonts w:ascii="Times New Roman" w:hAnsi="Times New Roman" w:cs="Times New Roman"/>
-        </w:rPr>
-        <w:t xml:space="preserve">. </w:t>
-      </w:r>
-      <w:r>
-        <w:rPr>
-          <w:rFonts w:ascii="Times New Roman" w:hAnsi="Times New Roman" w:cs="Times New Roman"/>
-        </w:rPr>
-        <w:t>The data was cleaned and organized into two columns</w:t>
-      </w:r>
-      <w:r>
-        <w:rPr>
-          <w:rFonts w:ascii="Times New Roman" w:hAnsi="Times New Roman" w:cs="Times New Roman"/>
-        </w:rPr>
-        <w:t xml:space="preserve"> (‘Date’, ‘Water Volume’). Date being the observation date</w:t>
-      </w:r>
-      <w:r>
-        <w:rPr>
-          <w:rFonts w:ascii="Times New Roman" w:hAnsi="Times New Roman" w:cs="Times New Roman"/>
-        </w:rPr>
-        <w:t>/month</w:t>
-      </w:r>
-      <w:r>
-        <w:rPr>
-          <w:rFonts w:ascii="Times New Roman" w:hAnsi="Times New Roman" w:cs="Times New Roman"/>
-        </w:rPr>
-        <w:t xml:space="preserve">, and water volume being the </w:t>
-      </w:r>
-      <w:r>
-        <w:rPr>
-          <w:rFonts w:ascii="Times New Roman" w:hAnsi="Times New Roman" w:cs="Times New Roman"/>
-        </w:rPr>
-        <w:t>total saltwater disposal volume of said month.</w:t>
-      </w:r>
-      <w:r>
-        <w:rPr>
-          <w:rFonts w:ascii="Times New Roman" w:hAnsi="Times New Roman" w:cs="Times New Roman"/>
-        </w:rPr>
-        <w:t xml:space="preserve"> </w:t>
-      </w:r>
-    </w:p>
-    <w:p>
-      <w:pPr>
-        <w:rPr>
-          <w:rFonts w:ascii="Times New Roman" w:hAnsi="Times New Roman" w:cs="Times New Roman"/>
-        </w:rPr>
-      </w:pPr>
-      <w:r>
+    </w:p>
+    <w:p>
+      <w:pPr>
+        <w:spacing w:after="0" w:line="360" w:lineRule="auto"/>
+        <w:rPr>
+          <w:rFonts w:ascii="Times New Roman" w:hAnsi="Times New Roman" w:cs="Times New Roman"/>
+        </w:rPr>
+      </w:pPr>
+      <w:r>
+        <w:rPr>
+          <w:noProof/>
+        </w:rPr>
+        <w:drawing>
+          <wp:inline distT="0" distB="0" distL="0" distR="0" wp14:anchorId="094B7C12" wp14:editId="3FF6FD28">
+            <wp:extent cx="5943600" cy="2272367"/>
+            <wp:effectExtent l="0" t="0" r="0" b="0"/>
+            <wp:docPr id="1368298954" name="Picture 1368298954" descr="A graph showing a number of blue lines&#10;&#10;Description automatically generated with medium confidence"/>
+            <wp:cNvGraphicFramePr>
+              <a:graphicFrameLocks xmlns:a="http://schemas.openxmlformats.org/drawingml/2006/main" noChangeAspect="1"/>
+            </wp:cNvGraphicFramePr>
+            <a:graphic xmlns:a="http://schemas.openxmlformats.org/drawingml/2006/main">
+              <a:graphicData uri="http://schemas.openxmlformats.org/drawingml/2006/picture">
+                <pic:pic xmlns:pic="http://schemas.openxmlformats.org/drawingml/2006/picture">
+                  <pic:nvPicPr>
+                    <pic:cNvPr id="1368298954" name="Picture 1368298954" descr="A graph showing a number of blue lines&#10;&#10;Description automatically generated with medium confidence"/>
+                    <pic:cNvPicPr>
+                      <a:picLocks noChangeAspect="1" noChangeArrowheads="1"/>
+                    </pic:cNvPicPr>
+                  </pic:nvPicPr>
+                  <pic:blipFill>
+                    <a:blip r:embed="rId8" cstate="print">
+                      <a:extLst>
+                        <a:ext uri="{28A0092B-C50C-407E-A947-70E740481C1C}">
+                          <a14:useLocalDpi xmlns:a14="http://schemas.microsoft.com/office/drawing/2010/main" val="0"/>
+                        </a:ext>
+                      </a:extLst>
+                    </a:blip>
+                    <a:srcRect/>
+                    <a:stretch>
+                      <a:fillRect/>
+                    </a:stretch>
+                  </pic:blipFill>
+                  <pic:spPr bwMode="auto">
+                    <a:xfrm>
+                      <a:off x="0" y="0"/>
+                      <a:ext cx="5943600" cy="2272367"/>
+                    </a:xfrm>
+                    <a:prstGeom prst="rect">
+                      <a:avLst/>
+                    </a:prstGeom>
+                    <a:noFill/>
+                    <a:ln>
+                      <a:noFill/>
+                    </a:ln>
+                  </pic:spPr>
+                </pic:pic>
+              </a:graphicData>
+            </a:graphic>
+          </wp:inline>
+        </w:drawing>
+      </w:r>
+    </w:p>
+    <w:p>
+      <w:pPr>
+        <w:spacing w:after="0" w:line="360" w:lineRule="auto"/>
+        <w:rPr>
+          <w:rStyle w:val="Heading1Char"/>
+        </w:rPr>
+      </w:pPr>
+      <w:bookmarkStart w:id="2" w:name="_Toc239743803"/>
+    </w:p>
+    <w:p>
+      <w:pPr>
+        <w:spacing w:after="0" w:line="360" w:lineRule="auto"/>
         <w:rPr>
           <w:rFonts w:ascii="Times New Roman" w:hAnsi="Times New Roman" w:cs="Times New Roman"/>
           <w:b/>
           <w:bCs/>
         </w:rPr>
-        <w:t>Methodology:</w:t>
-      </w:r>
-      <w:r>
-        <w:rPr>
-          <w:rFonts w:ascii="Times New Roman" w:hAnsi="Times New Roman" w:cs="Times New Roman"/>
-          <w:b/>
-          <w:bCs/>
+      </w:pPr>
+      <w:r>
+        <w:rPr>
+          <w:rStyle w:val="Heading1Char"/>
+        </w:rPr>
+        <w:t>Methodology</w:t>
+      </w:r>
+      <w:bookmarkEnd w:id="2"/>
+    </w:p>
+    <w:p>
+      <w:pPr>
+        <w:spacing w:after="0" w:line="360" w:lineRule="auto"/>
+        <w:rPr>
+          <w:rFonts w:ascii="Times New Roman" w:hAnsi="Times New Roman" w:cs="Times New Roman"/>
+        </w:rPr>
+      </w:pPr>
+      <w:r>
+        <w:rPr>
+          <w:rFonts w:ascii="Times New Roman" w:hAnsi="Times New Roman" w:cs="Times New Roman"/>
+        </w:rPr>
+        <w:t xml:space="preserve">The data is a simple series so the first step in preparing for the model is making sure that the </w:t>
+      </w:r>
+      <w:r>
+        <w:rPr>
+          <w:rFonts w:ascii="Times New Roman" w:hAnsi="Times New Roman" w:cs="Times New Roman"/>
+        </w:rPr>
+        <w:t xml:space="preserve">data is stationary. After differencing the data once, the </w:t>
+      </w:r>
+      <w:r>
+        <w:rPr>
+          <w:rFonts w:ascii="Times New Roman" w:hAnsi="Times New Roman" w:cs="Times New Roman"/>
+        </w:rPr>
+        <w:t xml:space="preserve">Augmented </w:t>
+      </w:r>
+      <w:r>
+        <w:rPr>
+          <w:rFonts w:ascii="Times New Roman" w:hAnsi="Times New Roman" w:cs="Times New Roman"/>
+        </w:rPr>
+        <w:t xml:space="preserve">Dickey-Fuller test </w:t>
+      </w:r>
+      <w:r>
+        <w:rPr>
+          <w:rFonts w:ascii="Times New Roman" w:hAnsi="Times New Roman" w:cs="Times New Roman"/>
+        </w:rPr>
+        <w:t>was used to check for stationarity.</w:t>
+      </w:r>
+      <w:r>
+        <w:rPr>
+          <w:rFonts w:ascii="Times New Roman" w:hAnsi="Times New Roman" w:cs="Times New Roman"/>
         </w:rPr>
         <w:t xml:space="preserve"> </w:t>
       </w:r>
@@ -260,47 +802,12 @@
         <w:rPr>
           <w:rFonts w:ascii="Times New Roman" w:hAnsi="Times New Roman" w:cs="Times New Roman"/>
         </w:rPr>
-        <w:t xml:space="preserve">The data is a simple series so the first step in preparing for the model is making sure that the </w:t>
-      </w:r>
-      <w:r>
-        <w:rPr>
-          <w:rFonts w:ascii="Times New Roman" w:hAnsi="Times New Roman" w:cs="Times New Roman"/>
-        </w:rPr>
-        <w:t xml:space="preserve">data is stationary. After differencing the data once, the </w:t>
-      </w:r>
-      <w:r>
-        <w:rPr>
-          <w:rFonts w:ascii="Times New Roman" w:hAnsi="Times New Roman" w:cs="Times New Roman"/>
-        </w:rPr>
-        <w:t xml:space="preserve">Augmented </w:t>
-      </w:r>
-      <w:r>
-        <w:rPr>
-          <w:rFonts w:ascii="Times New Roman" w:hAnsi="Times New Roman" w:cs="Times New Roman"/>
-        </w:rPr>
-        <w:t xml:space="preserve">Dickey-Fuller test </w:t>
-      </w:r>
-      <w:r>
-        <w:rPr>
-          <w:rFonts w:ascii="Times New Roman" w:hAnsi="Times New Roman" w:cs="Times New Roman"/>
-        </w:rPr>
-        <w:t>was used to check for stationarity.</w:t>
-      </w:r>
-      <w:r>
-        <w:rPr>
-          <w:rFonts w:ascii="Times New Roman" w:hAnsi="Times New Roman" w:cs="Times New Roman"/>
-        </w:rPr>
-        <w:t xml:space="preserve"> </w:t>
-      </w:r>
-      <w:r>
-        <w:rPr>
-          <w:rFonts w:ascii="Times New Roman" w:hAnsi="Times New Roman" w:cs="Times New Roman"/>
-        </w:rPr>
         <w:t xml:space="preserve">This was a success. </w:t>
       </w:r>
     </w:p>
     <w:p>
       <w:pPr>
+        <w:spacing w:after="0" w:line="360" w:lineRule="auto"/>
         <w:rPr>
           <w:rFonts w:ascii="Times New Roman" w:hAnsi="Times New Roman" w:cs="Times New Roman"/>
           <w:noProof/>
@@ -327,7 +834,7 @@
                     <pic:cNvPicPr/>
                   </pic:nvPicPr>
                   <pic:blipFill>
-                    <a:blip r:embed="rId5"/>
+                    <a:blip r:embed="rId9"/>
                     <a:stretch>
                       <a:fillRect/>
                     </a:stretch>
@@ -350,17 +857,19 @@
     </w:p>
     <w:p>
       <w:pPr>
-        <w:rPr>
-          <w:rFonts w:ascii="Times New Roman" w:hAnsi="Times New Roman" w:cs="Times New Roman"/>
-          <w:noProof/>
-        </w:rPr>
-      </w:pPr>
-      <w:r>
-        <w:rPr>
-          <w:noProof/>
-        </w:rPr>
+        <w:spacing w:after="0" w:line="360" w:lineRule="auto"/>
+        <w:rPr>
+          <w:rFonts w:ascii="Times New Roman" w:hAnsi="Times New Roman" w:cs="Times New Roman"/>
+          <w:noProof/>
+        </w:rPr>
+      </w:pPr>
+      <w:r>
+        <w:rPr>
+          <w:noProof/>
+        </w:rPr>
+        <w:lastRenderedPageBreak/>
         <w:drawing>
-          <wp:inline distT="0" distB="0" distL="0" distR="0" wp14:anchorId="39AD01A9" wp14:editId="0493F94B">
+          <wp:inline distT="0" distB="0" distL="0" distR="0" wp14:anchorId="39AD01A9" wp14:editId="3A4F5F02">
             <wp:extent cx="5943600" cy="2285706"/>
             <wp:effectExtent l="0" t="0" r="0" b="635"/>
             <wp:docPr id="2" name="Picture 1" descr="A blue sound wave on a white background&#10;&#10;Description automatically generated"/>
@@ -377,7 +886,7 @@
                     </pic:cNvPicPr>
                   </pic:nvPicPr>
                   <pic:blipFill>
-                    <a:blip r:embed="rId6" cstate="print">
+                    <a:blip r:embed="rId10" cstate="print">
                       <a:extLst>
                         <a:ext uri="{28A0092B-C50C-407E-A947-70E740481C1C}">
                           <a14:useLocalDpi xmlns:a14="http://schemas.microsoft.com/office/drawing/2010/main" val="0"/>
@@ -411,6 +920,16 @@
     </w:p>
     <w:p>
       <w:pPr>
+        <w:spacing w:after="0" w:line="360" w:lineRule="auto"/>
+        <w:rPr>
+          <w:rFonts w:ascii="Times New Roman" w:hAnsi="Times New Roman" w:cs="Times New Roman"/>
+          <w:noProof/>
+        </w:rPr>
+      </w:pPr>
+    </w:p>
+    <w:p>
+      <w:pPr>
+        <w:spacing w:after="0" w:line="360" w:lineRule="auto"/>
         <w:rPr>
           <w:rFonts w:ascii="Times New Roman" w:hAnsi="Times New Roman" w:cs="Times New Roman"/>
           <w:noProof/>
@@ -440,14 +959,16 @@
     </w:p>
     <w:p>
       <w:pPr>
-        <w:rPr>
-          <w:rFonts w:ascii="Times New Roman" w:hAnsi="Times New Roman" w:cs="Times New Roman"/>
-          <w:noProof/>
-        </w:rPr>
-      </w:pPr>
-    </w:p>
-    <w:p>
-      <w:pPr>
+        <w:spacing w:after="0" w:line="360" w:lineRule="auto"/>
+        <w:rPr>
+          <w:rFonts w:ascii="Times New Roman" w:hAnsi="Times New Roman" w:cs="Times New Roman"/>
+          <w:noProof/>
+        </w:rPr>
+      </w:pPr>
+    </w:p>
+    <w:p>
+      <w:pPr>
+        <w:spacing w:after="0" w:line="360" w:lineRule="auto"/>
         <w:rPr>
           <w:rFonts w:ascii="Times New Roman" w:hAnsi="Times New Roman" w:cs="Times New Roman"/>
           <w:noProof/>
@@ -474,7 +995,7 @@
                     <pic:cNvPicPr/>
                   </pic:nvPicPr>
                   <pic:blipFill>
-                    <a:blip r:embed="rId7"/>
+                    <a:blip r:embed="rId11"/>
                     <a:stretch>
                       <a:fillRect/>
                     </a:stretch>
@@ -516,7 +1037,7 @@
                     </pic:cNvPicPr>
                   </pic:nvPicPr>
                   <pic:blipFill>
-                    <a:blip r:embed="rId8">
+                    <a:blip r:embed="rId12">
                       <a:extLst>
                         <a:ext uri="{28A0092B-C50C-407E-A947-70E740481C1C}">
                           <a14:useLocalDpi xmlns:a14="http://schemas.microsoft.com/office/drawing/2010/main" val="0"/>
@@ -550,6 +1071,243 @@
     </w:p>
     <w:p>
       <w:pPr>
+        <w:spacing w:after="0" w:line="360" w:lineRule="auto"/>
+        <w:rPr>
+          <w:rFonts w:ascii="Times New Roman" w:hAnsi="Times New Roman" w:cs="Times New Roman"/>
+          <w:noProof/>
+        </w:rPr>
+      </w:pPr>
+    </w:p>
+    <w:p>
+      <w:pPr>
+        <w:spacing w:after="0" w:line="360" w:lineRule="auto"/>
+        <w:rPr>
+          <w:rFonts w:ascii="Times New Roman" w:hAnsi="Times New Roman" w:cs="Times New Roman"/>
+          <w:noProof/>
+        </w:rPr>
+      </w:pPr>
+      <w:r>
+        <w:rPr>
+          <w:rFonts w:ascii="Times New Roman" w:hAnsi="Times New Roman" w:cs="Times New Roman"/>
+          <w:noProof/>
+        </w:rPr>
+        <w:t xml:space="preserve">It should be noted that the first lag is negative </w:t>
+      </w:r>
+      <w:r>
+        <w:rPr>
+          <w:rFonts w:ascii="Times New Roman" w:hAnsi="Times New Roman" w:cs="Times New Roman"/>
+          <w:noProof/>
+        </w:rPr>
+        <w:t xml:space="preserve">reveals that the </w:t>
+      </w:r>
+      <w:r>
+        <w:rPr>
+          <w:rFonts w:ascii="Times New Roman" w:hAnsi="Times New Roman" w:cs="Times New Roman"/>
+          <w:noProof/>
+        </w:rPr>
+        <w:t xml:space="preserve">high positive values tend to come before low positive values. </w:t>
+      </w:r>
+      <w:r>
+        <w:rPr>
+          <w:rFonts w:ascii="Times New Roman" w:hAnsi="Times New Roman" w:cs="Times New Roman"/>
+          <w:noProof/>
+        </w:rPr>
+        <w:t xml:space="preserve">This could be due to the </w:t>
+      </w:r>
+      <w:r>
+        <w:rPr>
+          <w:rFonts w:ascii="Times New Roman" w:hAnsi="Times New Roman" w:cs="Times New Roman"/>
+          <w:noProof/>
+        </w:rPr>
+        <w:t>data having large, unpredicatble jumps</w:t>
+      </w:r>
+      <w:r>
+        <w:rPr>
+          <w:rFonts w:ascii="Times New Roman" w:hAnsi="Times New Roman" w:cs="Times New Roman"/>
+          <w:noProof/>
+        </w:rPr>
+        <w:t xml:space="preserve"> up and down. A good insight into how </w:t>
+      </w:r>
+      <w:r>
+        <w:rPr>
+          <w:rFonts w:ascii="Times New Roman" w:hAnsi="Times New Roman" w:cs="Times New Roman"/>
+          <w:noProof/>
+        </w:rPr>
+        <w:t>the data behaves is on the 1</w:t>
+      </w:r>
+      <w:r>
+        <w:rPr>
+          <w:rFonts w:ascii="Times New Roman" w:hAnsi="Times New Roman" w:cs="Times New Roman"/>
+          <w:noProof/>
+        </w:rPr>
+        <w:t>1</w:t>
+      </w:r>
+      <w:r>
+        <w:rPr>
+          <w:rFonts w:ascii="Times New Roman" w:hAnsi="Times New Roman" w:cs="Times New Roman"/>
+          <w:noProof/>
+          <w:vertAlign w:val="superscript"/>
+        </w:rPr>
+        <w:t>th</w:t>
+      </w:r>
+      <w:r>
+        <w:rPr>
+          <w:rFonts w:ascii="Times New Roman" w:hAnsi="Times New Roman" w:cs="Times New Roman"/>
+          <w:noProof/>
+        </w:rPr>
+        <w:t xml:space="preserve"> through </w:t>
+      </w:r>
+      <w:r>
+        <w:rPr>
+          <w:rFonts w:ascii="Times New Roman" w:hAnsi="Times New Roman" w:cs="Times New Roman"/>
+          <w:noProof/>
+        </w:rPr>
+        <w:t>13</w:t>
+      </w:r>
+      <w:r>
+        <w:rPr>
+          <w:rFonts w:ascii="Times New Roman" w:hAnsi="Times New Roman" w:cs="Times New Roman"/>
+          <w:noProof/>
+          <w:vertAlign w:val="superscript"/>
+        </w:rPr>
+        <w:t>th</w:t>
+      </w:r>
+      <w:r>
+        <w:rPr>
+          <w:rFonts w:ascii="Times New Roman" w:hAnsi="Times New Roman" w:cs="Times New Roman"/>
+          <w:noProof/>
+        </w:rPr>
+        <w:t>. The negative, significant dip of the 11</w:t>
+      </w:r>
+      <w:r>
+        <w:rPr>
+          <w:rFonts w:ascii="Times New Roman" w:hAnsi="Times New Roman" w:cs="Times New Roman"/>
+          <w:noProof/>
+          <w:vertAlign w:val="superscript"/>
+        </w:rPr>
+        <w:t>th</w:t>
+      </w:r>
+      <w:r>
+        <w:rPr>
+          <w:rFonts w:ascii="Times New Roman" w:hAnsi="Times New Roman" w:cs="Times New Roman"/>
+          <w:noProof/>
+        </w:rPr>
+        <w:t xml:space="preserve"> lag </w:t>
+      </w:r>
+      <w:r>
+        <w:rPr>
+          <w:rFonts w:ascii="Times New Roman" w:hAnsi="Times New Roman" w:cs="Times New Roman"/>
+          <w:noProof/>
+        </w:rPr>
+        <w:t>immediately precedes the 12</w:t>
+      </w:r>
+      <w:r>
+        <w:rPr>
+          <w:rFonts w:ascii="Times New Roman" w:hAnsi="Times New Roman" w:cs="Times New Roman"/>
+          <w:noProof/>
+          <w:vertAlign w:val="superscript"/>
+        </w:rPr>
+        <w:t>th</w:t>
+      </w:r>
+      <w:r>
+        <w:rPr>
+          <w:rFonts w:ascii="Times New Roman" w:hAnsi="Times New Roman" w:cs="Times New Roman"/>
+          <w:noProof/>
+        </w:rPr>
+        <w:t xml:space="preserve"> positive significant lag. This bahavior </w:t>
+      </w:r>
+      <w:r>
+        <w:rPr>
+          <w:rFonts w:ascii="Times New Roman" w:hAnsi="Times New Roman" w:cs="Times New Roman"/>
+          <w:noProof/>
+        </w:rPr>
+        <w:t xml:space="preserve">is predictable, but also a yearly cycle where the </w:t>
+      </w:r>
+      <w:r>
+        <w:rPr>
+          <w:rFonts w:ascii="Times New Roman" w:hAnsi="Times New Roman" w:cs="Times New Roman"/>
+          <w:noProof/>
+        </w:rPr>
+        <w:t>positive lags at the 12</w:t>
+      </w:r>
+      <w:r>
+        <w:rPr>
+          <w:rFonts w:ascii="Times New Roman" w:hAnsi="Times New Roman" w:cs="Times New Roman"/>
+          <w:noProof/>
+          <w:vertAlign w:val="superscript"/>
+        </w:rPr>
+        <w:t>th</w:t>
+      </w:r>
+      <w:r>
+        <w:rPr>
+          <w:rFonts w:ascii="Times New Roman" w:hAnsi="Times New Roman" w:cs="Times New Roman"/>
+          <w:noProof/>
+        </w:rPr>
+        <w:t xml:space="preserve"> and 24</w:t>
+      </w:r>
+      <w:r>
+        <w:rPr>
+          <w:rFonts w:ascii="Times New Roman" w:hAnsi="Times New Roman" w:cs="Times New Roman"/>
+          <w:noProof/>
+          <w:vertAlign w:val="superscript"/>
+        </w:rPr>
+        <w:t>th</w:t>
+      </w:r>
+      <w:r>
+        <w:rPr>
+          <w:rFonts w:ascii="Times New Roman" w:hAnsi="Times New Roman" w:cs="Times New Roman"/>
+          <w:noProof/>
+        </w:rPr>
+        <w:t xml:space="preserve"> position indicate strong </w:t>
+      </w:r>
+      <w:r>
+        <w:rPr>
+          <w:rFonts w:ascii="Times New Roman" w:hAnsi="Times New Roman" w:cs="Times New Roman"/>
+          <w:noProof/>
+        </w:rPr>
+        <w:t xml:space="preserve">correlation to lag 0. </w:t>
+      </w:r>
+    </w:p>
+    <w:p>
+      <w:pPr>
+        <w:spacing w:after="0" w:line="360" w:lineRule="auto"/>
+        <w:rPr>
+          <w:rFonts w:ascii="Times New Roman" w:hAnsi="Times New Roman" w:cs="Times New Roman"/>
+          <w:noProof/>
+        </w:rPr>
+      </w:pPr>
+      <w:r>
+        <w:rPr>
+          <w:rFonts w:ascii="Times New Roman" w:hAnsi="Times New Roman" w:cs="Times New Roman"/>
+          <w:noProof/>
+        </w:rPr>
+        <w:t>Using the auto</w:t>
+      </w:r>
+      <w:r>
+        <w:rPr>
+          <w:rFonts w:ascii="Times New Roman" w:hAnsi="Times New Roman" w:cs="Times New Roman"/>
+          <w:noProof/>
+        </w:rPr>
+        <w:t xml:space="preserve"> arima function to solve which parameters would be </w:t>
+      </w:r>
+      <w:r>
+        <w:rPr>
+          <w:rFonts w:ascii="Times New Roman" w:hAnsi="Times New Roman" w:cs="Times New Roman"/>
+          <w:noProof/>
+        </w:rPr>
+        <w:t xml:space="preserve">best for the SARIMAX model, we find that </w:t>
+      </w:r>
+      <w:r>
+        <w:rPr>
+          <w:rFonts w:ascii="Times New Roman" w:hAnsi="Times New Roman" w:cs="Times New Roman"/>
+          <w:noProof/>
+        </w:rPr>
+        <w:t xml:space="preserve">ARIMA(1, 1, 0)(1, 0, 2, 12) is the best model. </w:t>
+      </w:r>
+    </w:p>
+    <w:p>
+      <w:pPr>
+        <w:spacing w:after="0" w:line="360" w:lineRule="auto"/>
         <w:rPr>
           <w:rFonts w:ascii="Times New Roman" w:hAnsi="Times New Roman" w:cs="Times New Roman"/>
           <w:noProof/>
@@ -561,231 +1319,6 @@
           <w:noProof/>
         </w:rPr>
         <w:lastRenderedPageBreak/>
-        <w:t xml:space="preserve">It should be noted that the first lag is negative </w:t>
-      </w:r>
-      <w:r>
-        <w:rPr>
-          <w:rFonts w:ascii="Times New Roman" w:hAnsi="Times New Roman" w:cs="Times New Roman"/>
-          <w:noProof/>
-        </w:rPr>
-        <w:t xml:space="preserve">reveals that the </w:t>
-      </w:r>
-      <w:r>
-        <w:rPr>
-          <w:rFonts w:ascii="Times New Roman" w:hAnsi="Times New Roman" w:cs="Times New Roman"/>
-          <w:noProof/>
-        </w:rPr>
-        <w:t xml:space="preserve">high positive values tend to come before low positive values. </w:t>
-      </w:r>
-      <w:r>
-        <w:rPr>
-          <w:rFonts w:ascii="Times New Roman" w:hAnsi="Times New Roman" w:cs="Times New Roman"/>
-          <w:noProof/>
-        </w:rPr>
-        <w:t xml:space="preserve">This could be due to the </w:t>
-      </w:r>
-      <w:r>
-        <w:rPr>
-          <w:rFonts w:ascii="Times New Roman" w:hAnsi="Times New Roman" w:cs="Times New Roman"/>
-          <w:noProof/>
-        </w:rPr>
-        <w:t>data having large, unpredicatble jumps</w:t>
-      </w:r>
-      <w:r>
-        <w:rPr>
-          <w:rFonts w:ascii="Times New Roman" w:hAnsi="Times New Roman" w:cs="Times New Roman"/>
-          <w:noProof/>
-        </w:rPr>
-        <w:t xml:space="preserve"> up and down. A good insight into how </w:t>
-      </w:r>
-      <w:r>
-        <w:rPr>
-          <w:rFonts w:ascii="Times New Roman" w:hAnsi="Times New Roman" w:cs="Times New Roman"/>
-          <w:noProof/>
-        </w:rPr>
-        <w:t>the data behaves is on the 1</w:t>
-      </w:r>
-      <w:r>
-        <w:rPr>
-          <w:rFonts w:ascii="Times New Roman" w:hAnsi="Times New Roman" w:cs="Times New Roman"/>
-          <w:noProof/>
-        </w:rPr>
-        <w:t>1</w:t>
-      </w:r>
-      <w:r>
-        <w:rPr>
-          <w:rFonts w:ascii="Times New Roman" w:hAnsi="Times New Roman" w:cs="Times New Roman"/>
-          <w:noProof/>
-          <w:vertAlign w:val="superscript"/>
-        </w:rPr>
-        <w:t>th</w:t>
-      </w:r>
-      <w:r>
-        <w:rPr>
-          <w:rFonts w:ascii="Times New Roman" w:hAnsi="Times New Roman" w:cs="Times New Roman"/>
-          <w:noProof/>
-        </w:rPr>
-        <w:t xml:space="preserve"> through </w:t>
-      </w:r>
-      <w:r>
-        <w:rPr>
-          <w:rFonts w:ascii="Times New Roman" w:hAnsi="Times New Roman" w:cs="Times New Roman"/>
-          <w:noProof/>
-        </w:rPr>
-        <w:t>13</w:t>
-      </w:r>
-      <w:r>
-        <w:rPr>
-          <w:rFonts w:ascii="Times New Roman" w:hAnsi="Times New Roman" w:cs="Times New Roman"/>
-          <w:noProof/>
-          <w:vertAlign w:val="superscript"/>
-        </w:rPr>
-        <w:t>th</w:t>
-      </w:r>
-      <w:r>
-        <w:rPr>
-          <w:rFonts w:ascii="Times New Roman" w:hAnsi="Times New Roman" w:cs="Times New Roman"/>
-          <w:noProof/>
-        </w:rPr>
-        <w:t>. The negative, significant dip of the 11</w:t>
-      </w:r>
-      <w:r>
-        <w:rPr>
-          <w:rFonts w:ascii="Times New Roman" w:hAnsi="Times New Roman" w:cs="Times New Roman"/>
-          <w:noProof/>
-          <w:vertAlign w:val="superscript"/>
-        </w:rPr>
-        <w:t>th</w:t>
-      </w:r>
-      <w:r>
-        <w:rPr>
-          <w:rFonts w:ascii="Times New Roman" w:hAnsi="Times New Roman" w:cs="Times New Roman"/>
-          <w:noProof/>
-        </w:rPr>
-        <w:t xml:space="preserve"> lag </w:t>
-      </w:r>
-      <w:r>
-        <w:rPr>
-          <w:rFonts w:ascii="Times New Roman" w:hAnsi="Times New Roman" w:cs="Times New Roman"/>
-          <w:noProof/>
-        </w:rPr>
-        <w:t>immediately precedes the 12</w:t>
-      </w:r>
-      <w:r>
-        <w:rPr>
-          <w:rFonts w:ascii="Times New Roman" w:hAnsi="Times New Roman" w:cs="Times New Roman"/>
-          <w:noProof/>
-          <w:vertAlign w:val="superscript"/>
-        </w:rPr>
-        <w:t>th</w:t>
-      </w:r>
-      <w:r>
-        <w:rPr>
-          <w:rFonts w:ascii="Times New Roman" w:hAnsi="Times New Roman" w:cs="Times New Roman"/>
-          <w:noProof/>
-        </w:rPr>
-        <w:t xml:space="preserve"> positive significant lag. This bahavior </w:t>
-      </w:r>
-      <w:r>
-        <w:rPr>
-          <w:rFonts w:ascii="Times New Roman" w:hAnsi="Times New Roman" w:cs="Times New Roman"/>
-          <w:noProof/>
-        </w:rPr>
-        <w:t xml:space="preserve">is predictable, but also a yearly cycle where the </w:t>
-      </w:r>
-      <w:r>
-        <w:rPr>
-          <w:rFonts w:ascii="Times New Roman" w:hAnsi="Times New Roman" w:cs="Times New Roman"/>
-          <w:noProof/>
-        </w:rPr>
-        <w:t>positive lags at the 12</w:t>
-      </w:r>
-      <w:r>
-        <w:rPr>
-          <w:rFonts w:ascii="Times New Roman" w:hAnsi="Times New Roman" w:cs="Times New Roman"/>
-          <w:noProof/>
-          <w:vertAlign w:val="superscript"/>
-        </w:rPr>
-        <w:t>th</w:t>
-      </w:r>
-      <w:r>
-        <w:rPr>
-          <w:rFonts w:ascii="Times New Roman" w:hAnsi="Times New Roman" w:cs="Times New Roman"/>
-          <w:noProof/>
-        </w:rPr>
-        <w:t xml:space="preserve"> and 24</w:t>
-      </w:r>
-      <w:r>
-        <w:rPr>
-          <w:rFonts w:ascii="Times New Roman" w:hAnsi="Times New Roman" w:cs="Times New Roman"/>
-          <w:noProof/>
-          <w:vertAlign w:val="superscript"/>
-        </w:rPr>
-        <w:t>th</w:t>
-      </w:r>
-      <w:r>
-        <w:rPr>
-          <w:rFonts w:ascii="Times New Roman" w:hAnsi="Times New Roman" w:cs="Times New Roman"/>
-          <w:noProof/>
-        </w:rPr>
-        <w:t xml:space="preserve"> position indicate strong </w:t>
-      </w:r>
-      <w:r>
-        <w:rPr>
-          <w:rFonts w:ascii="Times New Roman" w:hAnsi="Times New Roman" w:cs="Times New Roman"/>
-          <w:noProof/>
-        </w:rPr>
-        <w:t xml:space="preserve">correlation to lag 0. </w:t>
-      </w:r>
-    </w:p>
-    <w:p>
-      <w:pPr>
-        <w:rPr>
-          <w:rFonts w:ascii="Times New Roman" w:hAnsi="Times New Roman" w:cs="Times New Roman"/>
-          <w:noProof/>
-        </w:rPr>
-      </w:pPr>
-      <w:r>
-        <w:rPr>
-          <w:rFonts w:ascii="Times New Roman" w:hAnsi="Times New Roman" w:cs="Times New Roman"/>
-          <w:noProof/>
-        </w:rPr>
-        <w:t>Using the auto</w:t>
-      </w:r>
-      <w:r>
-        <w:rPr>
-          <w:rFonts w:ascii="Times New Roman" w:hAnsi="Times New Roman" w:cs="Times New Roman"/>
-          <w:noProof/>
-        </w:rPr>
-        <w:t xml:space="preserve"> arima function to solve which parameters would be </w:t>
-      </w:r>
-      <w:r>
-        <w:rPr>
-          <w:rFonts w:ascii="Times New Roman" w:hAnsi="Times New Roman" w:cs="Times New Roman"/>
-          <w:noProof/>
-        </w:rPr>
-        <w:t xml:space="preserve">best for the SARIMAX model, we find that </w:t>
-      </w:r>
-      <w:r>
-        <w:rPr>
-          <w:rFonts w:ascii="Times New Roman" w:hAnsi="Times New Roman" w:cs="Times New Roman"/>
-          <w:noProof/>
-        </w:rPr>
-        <w:t xml:space="preserve">ARIMA(1, 1, 0)(1, 0, 2, 12) is the best model. </w:t>
-      </w:r>
-    </w:p>
-    <w:p>
-      <w:pPr>
-        <w:rPr>
-          <w:rFonts w:ascii="Times New Roman" w:hAnsi="Times New Roman" w:cs="Times New Roman"/>
-          <w:noProof/>
-        </w:rPr>
-      </w:pPr>
-      <w:r>
-        <w:rPr>
-          <w:rFonts w:ascii="Times New Roman" w:hAnsi="Times New Roman" w:cs="Times New Roman"/>
-          <w:noProof/>
-        </w:rPr>
         <w:drawing>
           <wp:inline distT="0" distB="0" distL="0" distR="0" wp14:anchorId="7B609EF9" wp14:editId="44BFA460">
             <wp:extent cx="4677428" cy="5249008"/>
@@ -802,7 +1335,7 @@
                     <pic:cNvPicPr/>
                   </pic:nvPicPr>
                   <pic:blipFill>
-                    <a:blip r:embed="rId9"/>
+                    <a:blip r:embed="rId13"/>
                     <a:stretch>
                       <a:fillRect/>
                     </a:stretch>
@@ -825,14 +1358,16 @@
     </w:p>
     <w:p>
       <w:pPr>
-        <w:rPr>
-          <w:rFonts w:ascii="Times New Roman" w:hAnsi="Times New Roman" w:cs="Times New Roman"/>
-          <w:noProof/>
-        </w:rPr>
-      </w:pPr>
-    </w:p>
-    <w:p>
-      <w:pPr>
+        <w:spacing w:after="0" w:line="360" w:lineRule="auto"/>
+        <w:rPr>
+          <w:rFonts w:ascii="Times New Roman" w:hAnsi="Times New Roman" w:cs="Times New Roman"/>
+          <w:noProof/>
+        </w:rPr>
+      </w:pPr>
+    </w:p>
+    <w:p>
+      <w:pPr>
+        <w:spacing w:after="0" w:line="360" w:lineRule="auto"/>
         <w:rPr>
           <w:rFonts w:ascii="Times New Roman" w:hAnsi="Times New Roman" w:cs="Times New Roman"/>
           <w:noProof/>
@@ -904,14 +1439,193 @@
     </w:p>
     <w:p>
       <w:pPr>
-        <w:rPr>
-          <w:rFonts w:ascii="Times New Roman" w:hAnsi="Times New Roman" w:cs="Times New Roman"/>
-          <w:noProof/>
-        </w:rPr>
-      </w:pPr>
-    </w:p>
-    <w:p>
-      <w:pPr>
+        <w:spacing w:after="0" w:line="360" w:lineRule="auto"/>
+        <w:rPr>
+          <w:rFonts w:ascii="Times New Roman" w:hAnsi="Times New Roman" w:cs="Times New Roman"/>
+          <w:noProof/>
+        </w:rPr>
+      </w:pPr>
+    </w:p>
+    <w:p>
+      <w:pPr>
+        <w:spacing w:after="0" w:line="360" w:lineRule="auto"/>
+        <w:rPr>
+          <w:rFonts w:ascii="Times New Roman" w:hAnsi="Times New Roman" w:cs="Times New Roman"/>
+          <w:noProof/>
+        </w:rPr>
+      </w:pPr>
+      <w:r>
+        <w:rPr>
+          <w:rFonts w:ascii="Times New Roman" w:hAnsi="Times New Roman" w:cs="Times New Roman"/>
+          <w:noProof/>
+        </w:rPr>
+        <w:t xml:space="preserve">In addition to </w:t>
+      </w:r>
+      <w:r>
+        <w:rPr>
+          <w:rFonts w:ascii="Times New Roman" w:hAnsi="Times New Roman" w:cs="Times New Roman"/>
+          <w:noProof/>
+        </w:rPr>
+        <w:t>the endogenous time series</w:t>
+      </w:r>
+      <w:r>
+        <w:rPr>
+          <w:rFonts w:ascii="Times New Roman" w:hAnsi="Times New Roman" w:cs="Times New Roman"/>
+          <w:noProof/>
+        </w:rPr>
+        <w:t xml:space="preserve"> </w:t>
+      </w:r>
+      <w:r>
+        <w:rPr>
+          <w:rFonts w:ascii="Times New Roman" w:hAnsi="Times New Roman" w:cs="Times New Roman"/>
+          <w:noProof/>
+        </w:rPr>
+        <w:t>variable</w:t>
+      </w:r>
+      <w:r>
+        <w:rPr>
+          <w:rFonts w:ascii="Times New Roman" w:hAnsi="Times New Roman" w:cs="Times New Roman"/>
+          <w:noProof/>
+        </w:rPr>
+        <w:t xml:space="preserve">, saltwater disposal volume, </w:t>
+      </w:r>
+      <w:r>
+        <w:rPr>
+          <w:rFonts w:ascii="Times New Roman" w:hAnsi="Times New Roman" w:cs="Times New Roman"/>
+          <w:noProof/>
+        </w:rPr>
+        <w:t xml:space="preserve">two additional sources were </w:t>
+      </w:r>
+      <w:r>
+        <w:rPr>
+          <w:rFonts w:ascii="Times New Roman" w:hAnsi="Times New Roman" w:cs="Times New Roman"/>
+          <w:noProof/>
+        </w:rPr>
+        <w:t xml:space="preserve">introduced to </w:t>
+      </w:r>
+      <w:r>
+        <w:rPr>
+          <w:rFonts w:ascii="Times New Roman" w:hAnsi="Times New Roman" w:cs="Times New Roman"/>
+          <w:noProof/>
+        </w:rPr>
+        <w:t xml:space="preserve">help with the unexplained </w:t>
+      </w:r>
+      <w:r>
+        <w:rPr>
+          <w:rFonts w:ascii="Times New Roman" w:hAnsi="Times New Roman" w:cs="Times New Roman"/>
+          <w:noProof/>
+        </w:rPr>
+        <w:t xml:space="preserve">error </w:t>
+      </w:r>
+      <w:r>
+        <w:rPr>
+          <w:rFonts w:ascii="Times New Roman" w:hAnsi="Times New Roman" w:cs="Times New Roman"/>
+          <w:noProof/>
+        </w:rPr>
+        <w:t xml:space="preserve">in the model. </w:t>
+      </w:r>
+      <w:r>
+        <w:rPr>
+          <w:rFonts w:ascii="Times New Roman" w:hAnsi="Times New Roman" w:cs="Times New Roman"/>
+          <w:noProof/>
+        </w:rPr>
+        <w:t xml:space="preserve">The first source is the Brent Crude </w:t>
+      </w:r>
+      <w:r>
+        <w:rPr>
+          <w:rFonts w:ascii="Times New Roman" w:hAnsi="Times New Roman" w:cs="Times New Roman"/>
+          <w:noProof/>
+        </w:rPr>
+        <w:t xml:space="preserve">price index from the FRED website. This data was introduced to </w:t>
+      </w:r>
+      <w:r>
+        <w:rPr>
+          <w:rFonts w:ascii="Times New Roman" w:hAnsi="Times New Roman" w:cs="Times New Roman"/>
+          <w:noProof/>
+        </w:rPr>
+        <w:t>explaine the varied entries in disposal volume</w:t>
+      </w:r>
+      <w:r>
+        <w:rPr>
+          <w:rFonts w:ascii="Times New Roman" w:hAnsi="Times New Roman" w:cs="Times New Roman"/>
+          <w:noProof/>
+        </w:rPr>
+        <w:t xml:space="preserve">, </w:t>
+      </w:r>
+      <w:r>
+        <w:rPr>
+          <w:rFonts w:ascii="Times New Roman" w:hAnsi="Times New Roman" w:cs="Times New Roman"/>
+          <w:noProof/>
+        </w:rPr>
+        <w:t>i.e.</w:t>
+      </w:r>
+      <w:r>
+        <w:rPr>
+          <w:rFonts w:ascii="Times New Roman" w:hAnsi="Times New Roman" w:cs="Times New Roman"/>
+          <w:noProof/>
+        </w:rPr>
+        <w:t xml:space="preserve">, </w:t>
+      </w:r>
+      <w:r>
+        <w:rPr>
+          <w:rFonts w:ascii="Times New Roman" w:hAnsi="Times New Roman" w:cs="Times New Roman"/>
+          <w:noProof/>
+        </w:rPr>
+        <w:t xml:space="preserve"> </w:t>
+      </w:r>
+      <w:r>
+        <w:rPr>
+          <w:rFonts w:ascii="Times New Roman" w:hAnsi="Times New Roman" w:cs="Times New Roman"/>
+          <w:noProof/>
+        </w:rPr>
+        <w:t xml:space="preserve">the </w:t>
+      </w:r>
+      <w:r>
+        <w:rPr>
+          <w:rFonts w:ascii="Times New Roman" w:hAnsi="Times New Roman" w:cs="Times New Roman"/>
+          <w:noProof/>
+        </w:rPr>
+        <w:t xml:space="preserve">price of oil </w:t>
+      </w:r>
+      <w:r>
+        <w:rPr>
+          <w:rFonts w:ascii="Times New Roman" w:hAnsi="Times New Roman" w:cs="Times New Roman"/>
+          <w:noProof/>
+        </w:rPr>
+        <w:t xml:space="preserve">increases which may increase </w:t>
+      </w:r>
+      <w:r>
+        <w:rPr>
+          <w:rFonts w:ascii="Times New Roman" w:hAnsi="Times New Roman" w:cs="Times New Roman"/>
+          <w:noProof/>
+        </w:rPr>
+        <w:t xml:space="preserve">the firms disposal volume. </w:t>
+      </w:r>
+      <w:r>
+        <w:rPr>
+          <w:rFonts w:ascii="Times New Roman" w:hAnsi="Times New Roman" w:cs="Times New Roman"/>
+          <w:noProof/>
+        </w:rPr>
+        <w:t xml:space="preserve">The second source of information was the Texas Railroad Commision and their East Texas oil production data. </w:t>
+      </w:r>
+      <w:r>
+        <w:rPr>
+          <w:rFonts w:ascii="Times New Roman" w:hAnsi="Times New Roman" w:cs="Times New Roman"/>
+          <w:noProof/>
+        </w:rPr>
+        <w:t xml:space="preserve">This would help explain why the disposal volume has fallen over the past </w:t>
+      </w:r>
+      <w:r>
+        <w:rPr>
+          <w:rFonts w:ascii="Times New Roman" w:hAnsi="Times New Roman" w:cs="Times New Roman"/>
+          <w:noProof/>
+        </w:rPr>
+        <w:t xml:space="preserve">twenty years which helps the accuracy of the model. </w:t>
+      </w:r>
+    </w:p>
+    <w:p>
+      <w:pPr>
+        <w:spacing w:after="0" w:line="360" w:lineRule="auto"/>
         <w:rPr>
           <w:rFonts w:ascii="Times New Roman" w:hAnsi="Times New Roman" w:cs="Times New Roman"/>
           <w:noProof/>
@@ -923,182 +1637,6 @@
           <w:noProof/>
         </w:rPr>
         <w:lastRenderedPageBreak/>
-        <w:t xml:space="preserve">In addition to </w:t>
-      </w:r>
-      <w:r>
-        <w:rPr>
-          <w:rFonts w:ascii="Times New Roman" w:hAnsi="Times New Roman" w:cs="Times New Roman"/>
-          <w:noProof/>
-        </w:rPr>
-        <w:t>the endogenous time series</w:t>
-      </w:r>
-      <w:r>
-        <w:rPr>
-          <w:rFonts w:ascii="Times New Roman" w:hAnsi="Times New Roman" w:cs="Times New Roman"/>
-          <w:noProof/>
-        </w:rPr>
-        <w:t xml:space="preserve"> </w:t>
-      </w:r>
-      <w:r>
-        <w:rPr>
-          <w:rFonts w:ascii="Times New Roman" w:hAnsi="Times New Roman" w:cs="Times New Roman"/>
-          <w:noProof/>
-        </w:rPr>
-        <w:t>variable</w:t>
-      </w:r>
-      <w:r>
-        <w:rPr>
-          <w:rFonts w:ascii="Times New Roman" w:hAnsi="Times New Roman" w:cs="Times New Roman"/>
-          <w:noProof/>
-        </w:rPr>
-        <w:t xml:space="preserve">, saltwater disposal volume, </w:t>
-      </w:r>
-      <w:r>
-        <w:rPr>
-          <w:rFonts w:ascii="Times New Roman" w:hAnsi="Times New Roman" w:cs="Times New Roman"/>
-          <w:noProof/>
-        </w:rPr>
-        <w:t xml:space="preserve">two additional sources were </w:t>
-      </w:r>
-      <w:r>
-        <w:rPr>
-          <w:rFonts w:ascii="Times New Roman" w:hAnsi="Times New Roman" w:cs="Times New Roman"/>
-          <w:noProof/>
-        </w:rPr>
-        <w:t xml:space="preserve">introduced to </w:t>
-      </w:r>
-      <w:r>
-        <w:rPr>
-          <w:rFonts w:ascii="Times New Roman" w:hAnsi="Times New Roman" w:cs="Times New Roman"/>
-          <w:noProof/>
-        </w:rPr>
-        <w:t xml:space="preserve">help with the unexplained </w:t>
-      </w:r>
-      <w:r>
-        <w:rPr>
-          <w:rFonts w:ascii="Times New Roman" w:hAnsi="Times New Roman" w:cs="Times New Roman"/>
-          <w:noProof/>
-        </w:rPr>
-        <w:t xml:space="preserve">error </w:t>
-      </w:r>
-      <w:r>
-        <w:rPr>
-          <w:rFonts w:ascii="Times New Roman" w:hAnsi="Times New Roman" w:cs="Times New Roman"/>
-          <w:noProof/>
-        </w:rPr>
-        <w:t xml:space="preserve">in the model. </w:t>
-      </w:r>
-      <w:r>
-        <w:rPr>
-          <w:rFonts w:ascii="Times New Roman" w:hAnsi="Times New Roman" w:cs="Times New Roman"/>
-          <w:noProof/>
-        </w:rPr>
-        <w:t xml:space="preserve">The first source is the Brent Crude </w:t>
-      </w:r>
-      <w:r>
-        <w:rPr>
-          <w:rFonts w:ascii="Times New Roman" w:hAnsi="Times New Roman" w:cs="Times New Roman"/>
-          <w:noProof/>
-        </w:rPr>
-        <w:t xml:space="preserve">price index from the FRED website. This data was introduced to </w:t>
-      </w:r>
-      <w:r>
-        <w:rPr>
-          <w:rFonts w:ascii="Times New Roman" w:hAnsi="Times New Roman" w:cs="Times New Roman"/>
-          <w:noProof/>
-        </w:rPr>
-        <w:t>explaine the varied entries in disposal volume</w:t>
-      </w:r>
-      <w:r>
-        <w:rPr>
-          <w:rFonts w:ascii="Times New Roman" w:hAnsi="Times New Roman" w:cs="Times New Roman"/>
-          <w:noProof/>
-        </w:rPr>
-        <w:t xml:space="preserve">, </w:t>
-      </w:r>
-      <w:r>
-        <w:rPr>
-          <w:rFonts w:ascii="Times New Roman" w:hAnsi="Times New Roman" w:cs="Times New Roman"/>
-          <w:noProof/>
-        </w:rPr>
-        <w:t>i.e.</w:t>
-      </w:r>
-      <w:r>
-        <w:rPr>
-          <w:rFonts w:ascii="Times New Roman" w:hAnsi="Times New Roman" w:cs="Times New Roman"/>
-          <w:noProof/>
-        </w:rPr>
-        <w:t xml:space="preserve">, </w:t>
-      </w:r>
-      <w:r>
-        <w:rPr>
-          <w:rFonts w:ascii="Times New Roman" w:hAnsi="Times New Roman" w:cs="Times New Roman"/>
-          <w:noProof/>
-        </w:rPr>
-        <w:t xml:space="preserve"> </w:t>
-      </w:r>
-      <w:r>
-        <w:rPr>
-          <w:rFonts w:ascii="Times New Roman" w:hAnsi="Times New Roman" w:cs="Times New Roman"/>
-          <w:noProof/>
-        </w:rPr>
-        <w:t xml:space="preserve">the </w:t>
-      </w:r>
-      <w:r>
-        <w:rPr>
-          <w:rFonts w:ascii="Times New Roman" w:hAnsi="Times New Roman" w:cs="Times New Roman"/>
-          <w:noProof/>
-        </w:rPr>
-        <w:t xml:space="preserve">price of oil </w:t>
-      </w:r>
-      <w:r>
-        <w:rPr>
-          <w:rFonts w:ascii="Times New Roman" w:hAnsi="Times New Roman" w:cs="Times New Roman"/>
-          <w:noProof/>
-        </w:rPr>
-        <w:t xml:space="preserve">increases which may increase </w:t>
-      </w:r>
-      <w:r>
-        <w:rPr>
-          <w:rFonts w:ascii="Times New Roman" w:hAnsi="Times New Roman" w:cs="Times New Roman"/>
-          <w:noProof/>
-        </w:rPr>
-        <w:t xml:space="preserve">the firms disposal volume. </w:t>
-      </w:r>
-      <w:r>
-        <w:rPr>
-          <w:rFonts w:ascii="Times New Roman" w:hAnsi="Times New Roman" w:cs="Times New Roman"/>
-          <w:noProof/>
-        </w:rPr>
-        <w:t xml:space="preserve">The second source of information was the Texas Railroad Commision and their East Texas oil production data. </w:t>
-      </w:r>
-      <w:r>
-        <w:rPr>
-          <w:rFonts w:ascii="Times New Roman" w:hAnsi="Times New Roman" w:cs="Times New Roman"/>
-          <w:noProof/>
-        </w:rPr>
-        <w:t xml:space="preserve">This would help explain why the disposal volume has fallen over the past </w:t>
-      </w:r>
-      <w:r>
-        <w:rPr>
-          <w:rFonts w:ascii="Times New Roman" w:hAnsi="Times New Roman" w:cs="Times New Roman"/>
-          <w:noProof/>
-        </w:rPr>
-        <w:t xml:space="preserve">twenty years which helps the accuracy of the model. </w:t>
-      </w:r>
-    </w:p>
-    <w:p>
-      <w:pPr>
-        <w:rPr>
-          <w:rFonts w:ascii="Times New Roman" w:hAnsi="Times New Roman" w:cs="Times New Roman"/>
-          <w:noProof/>
-        </w:rPr>
-      </w:pPr>
-      <w:r>
-        <w:rPr>
-          <w:rFonts w:ascii="Times New Roman" w:hAnsi="Times New Roman" w:cs="Times New Roman"/>
-          <w:noProof/>
-        </w:rPr>
         <w:drawing>
           <wp:inline distT="0" distB="0" distL="0" distR="0" wp14:anchorId="038ED601" wp14:editId="4398909C">
             <wp:extent cx="5645442" cy="2933700"/>
@@ -1115,7 +1653,7 @@
                     <pic:cNvPicPr/>
                   </pic:nvPicPr>
                   <pic:blipFill>
-                    <a:blip r:embed="rId10"/>
+                    <a:blip r:embed="rId14"/>
                     <a:stretch>
                       <a:fillRect/>
                     </a:stretch>
@@ -1138,14 +1676,16 @@
     </w:p>
     <w:p>
       <w:pPr>
-        <w:rPr>
-          <w:rFonts w:ascii="Times New Roman" w:hAnsi="Times New Roman" w:cs="Times New Roman"/>
-          <w:noProof/>
-        </w:rPr>
-      </w:pPr>
-    </w:p>
-    <w:p>
-      <w:pPr>
+        <w:spacing w:after="0" w:line="360" w:lineRule="auto"/>
+        <w:rPr>
+          <w:rFonts w:ascii="Times New Roman" w:hAnsi="Times New Roman" w:cs="Times New Roman"/>
+          <w:noProof/>
+        </w:rPr>
+      </w:pPr>
+    </w:p>
+    <w:p>
+      <w:pPr>
+        <w:spacing w:after="0" w:line="360" w:lineRule="auto"/>
         <w:rPr>
           <w:rFonts w:ascii="Times New Roman" w:hAnsi="Times New Roman" w:cs="Times New Roman"/>
           <w:noProof/>
@@ -1173,7 +1713,7 @@
                     </pic:cNvPicPr>
                   </pic:nvPicPr>
                   <pic:blipFill>
-                    <a:blip r:embed="rId11" cstate="print">
+                    <a:blip r:embed="rId15" cstate="print">
                       <a:extLst>
                         <a:ext uri="{28A0092B-C50C-407E-A947-70E740481C1C}">
                           <a14:useLocalDpi xmlns:a14="http://schemas.microsoft.com/office/drawing/2010/main" val="0"/>
@@ -1207,129 +1747,134 @@
     </w:p>
     <w:p>
       <w:pPr>
-        <w:rPr>
-          <w:rFonts w:ascii="Times New Roman" w:hAnsi="Times New Roman" w:cs="Times New Roman"/>
-          <w:noProof/>
-        </w:rPr>
-      </w:pPr>
-    </w:p>
-    <w:p>
-      <w:pPr>
-        <w:rPr>
-          <w:rFonts w:ascii="Times New Roman" w:hAnsi="Times New Roman" w:cs="Times New Roman"/>
-          <w:noProof/>
-        </w:rPr>
-      </w:pPr>
-    </w:p>
-    <w:p>
-      <w:pPr>
-        <w:rPr>
-          <w:rFonts w:ascii="Times New Roman" w:hAnsi="Times New Roman" w:cs="Times New Roman"/>
-          <w:noProof/>
-        </w:rPr>
-      </w:pPr>
-      <w:r>
+        <w:spacing w:after="0" w:line="360" w:lineRule="auto"/>
+        <w:rPr>
+          <w:rFonts w:ascii="Times New Roman" w:hAnsi="Times New Roman" w:cs="Times New Roman"/>
+          <w:noProof/>
+        </w:rPr>
+      </w:pPr>
+    </w:p>
+    <w:p>
+      <w:pPr>
+        <w:spacing w:after="0" w:line="360" w:lineRule="auto"/>
+        <w:rPr>
+          <w:rFonts w:ascii="Times New Roman" w:hAnsi="Times New Roman" w:cs="Times New Roman"/>
+          <w:noProof/>
+        </w:rPr>
+      </w:pPr>
+    </w:p>
+    <w:p>
+      <w:pPr>
+        <w:spacing w:after="0" w:line="360" w:lineRule="auto"/>
         <w:rPr>
           <w:rFonts w:ascii="Times New Roman" w:hAnsi="Times New Roman" w:cs="Times New Roman"/>
           <w:b/>
           <w:bCs/>
           <w:noProof/>
         </w:rPr>
+      </w:pPr>
+      <w:bookmarkStart w:id="3" w:name="_Toc239743804"/>
+      <w:r>
+        <w:rPr>
+          <w:rStyle w:val="Heading1Char"/>
+        </w:rPr>
+        <w:t>Results</w:t>
+      </w:r>
+      <w:bookmarkEnd w:id="3"/>
+    </w:p>
+    <w:p>
+      <w:pPr>
+        <w:spacing w:after="0" w:line="360" w:lineRule="auto"/>
+        <w:rPr>
+          <w:rFonts w:ascii="Times New Roman" w:hAnsi="Times New Roman" w:cs="Times New Roman"/>
+          <w:noProof/>
+        </w:rPr>
+      </w:pPr>
+      <w:r>
+        <w:rPr>
+          <w:rFonts w:ascii="Times New Roman" w:hAnsi="Times New Roman" w:cs="Times New Roman"/>
+          <w:noProof/>
+        </w:rPr>
+        <w:t xml:space="preserve">Now that all the data </w:t>
+      </w:r>
+      <w:r>
+        <w:rPr>
+          <w:rFonts w:ascii="Times New Roman" w:hAnsi="Times New Roman" w:cs="Times New Roman"/>
+          <w:noProof/>
+        </w:rPr>
+        <w:t>and necessary modeling information has been collected. The SARIMAX model could now be programmed.</w:t>
+      </w:r>
+      <w:r>
+        <w:rPr>
+          <w:rFonts w:ascii="Times New Roman" w:hAnsi="Times New Roman" w:cs="Times New Roman"/>
+          <w:noProof/>
+        </w:rPr>
+        <w:t xml:space="preserve"> The </w:t>
+      </w:r>
+      <w:r>
+        <w:rPr>
+          <w:rFonts w:ascii="Times New Roman" w:hAnsi="Times New Roman" w:cs="Times New Roman"/>
+          <w:noProof/>
+        </w:rPr>
+        <w:t xml:space="preserve">model was given training data from </w:t>
+      </w:r>
+      <w:r>
+        <w:rPr>
+          <w:rFonts w:ascii="Times New Roman" w:hAnsi="Times New Roman" w:cs="Times New Roman"/>
+          <w:noProof/>
+        </w:rPr>
+        <w:t>1998-01-01 to 2025</w:t>
+      </w:r>
+      <w:r>
+        <w:rPr>
+          <w:rFonts w:ascii="Times New Roman" w:hAnsi="Times New Roman" w:cs="Times New Roman"/>
+          <w:noProof/>
+        </w:rPr>
+        <w:t xml:space="preserve">-04-01. The model uses this data to predict the next </w:t>
+      </w:r>
+      <w:r>
+        <w:rPr>
+          <w:rFonts w:ascii="Times New Roman" w:hAnsi="Times New Roman" w:cs="Times New Roman"/>
+          <w:noProof/>
+        </w:rPr>
+        <w:t>outcomes. Our validation data was set for 2025-05</w:t>
+      </w:r>
+      <w:r>
+        <w:rPr>
+          <w:rFonts w:ascii="Times New Roman" w:hAnsi="Times New Roman" w:cs="Times New Roman"/>
+          <w:noProof/>
+        </w:rPr>
+        <w:t xml:space="preserve">-01 to 2026-05-01. </w:t>
+      </w:r>
+      <w:r>
+        <w:rPr>
+          <w:rFonts w:ascii="Times New Roman" w:hAnsi="Times New Roman" w:cs="Times New Roman"/>
+          <w:noProof/>
+        </w:rPr>
+        <w:t xml:space="preserve">The SARIMAX will then compare its prediction to the </w:t>
+      </w:r>
+      <w:r>
+        <w:rPr>
+          <w:rFonts w:ascii="Times New Roman" w:hAnsi="Times New Roman" w:cs="Times New Roman"/>
+          <w:noProof/>
+        </w:rPr>
+        <w:t xml:space="preserve">validation data. </w:t>
+      </w:r>
+    </w:p>
+    <w:p>
+      <w:pPr>
+        <w:spacing w:after="0" w:line="360" w:lineRule="auto"/>
+        <w:rPr>
+          <w:rFonts w:ascii="Times New Roman" w:hAnsi="Times New Roman" w:cs="Times New Roman"/>
+          <w:noProof/>
+        </w:rPr>
+      </w:pPr>
+      <w:r>
+        <w:rPr>
+          <w:rFonts w:ascii="Times New Roman" w:hAnsi="Times New Roman" w:cs="Times New Roman"/>
+          <w:noProof/>
+        </w:rPr>
         <w:lastRenderedPageBreak/>
-        <w:t>Results:</w:t>
-      </w:r>
-      <w:r>
-        <w:rPr>
-          <w:rFonts w:ascii="Times New Roman" w:hAnsi="Times New Roman" w:cs="Times New Roman"/>
-          <w:b/>
-          <w:bCs/>
-          <w:noProof/>
-        </w:rPr>
-        <w:t xml:space="preserve"> </w:t>
-      </w:r>
-      <w:r>
-        <w:rPr>
-          <w:rFonts w:ascii="Times New Roman" w:hAnsi="Times New Roman" w:cs="Times New Roman"/>
-          <w:noProof/>
-        </w:rPr>
-        <w:t xml:space="preserve">Now that all the data </w:t>
-      </w:r>
-      <w:r>
-        <w:rPr>
-          <w:rFonts w:ascii="Times New Roman" w:hAnsi="Times New Roman" w:cs="Times New Roman"/>
-          <w:noProof/>
-        </w:rPr>
-        <w:t>and necessary modeling information has been collected. The SARIMAX model could now be programmed.</w:t>
-      </w:r>
-      <w:r>
-        <w:rPr>
-          <w:rFonts w:ascii="Times New Roman" w:hAnsi="Times New Roman" w:cs="Times New Roman"/>
-          <w:noProof/>
-        </w:rPr>
-        <w:t xml:space="preserve"> The </w:t>
-      </w:r>
-      <w:r>
-        <w:rPr>
-          <w:rFonts w:ascii="Times New Roman" w:hAnsi="Times New Roman" w:cs="Times New Roman"/>
-          <w:noProof/>
-        </w:rPr>
-        <w:t xml:space="preserve">model was given training data from </w:t>
-      </w:r>
-      <w:r>
-        <w:rPr>
-          <w:rFonts w:ascii="Times New Roman" w:hAnsi="Times New Roman" w:cs="Times New Roman"/>
-          <w:noProof/>
-        </w:rPr>
-        <w:t>1998-01-01 to 2025</w:t>
-      </w:r>
-      <w:r>
-        <w:rPr>
-          <w:rFonts w:ascii="Times New Roman" w:hAnsi="Times New Roman" w:cs="Times New Roman"/>
-          <w:noProof/>
-        </w:rPr>
-        <w:t xml:space="preserve">-04-01. The model uses this data to predict the next </w:t>
-      </w:r>
-      <w:r>
-        <w:rPr>
-          <w:rFonts w:ascii="Times New Roman" w:hAnsi="Times New Roman" w:cs="Times New Roman"/>
-          <w:noProof/>
-        </w:rPr>
-        <w:t>outcomes. Our validation data was set for 2025-05</w:t>
-      </w:r>
-      <w:r>
-        <w:rPr>
-          <w:rFonts w:ascii="Times New Roman" w:hAnsi="Times New Roman" w:cs="Times New Roman"/>
-          <w:noProof/>
-        </w:rPr>
-        <w:t xml:space="preserve">-01 to 2026-05-01. </w:t>
-      </w:r>
-      <w:r>
-        <w:rPr>
-          <w:rFonts w:ascii="Times New Roman" w:hAnsi="Times New Roman" w:cs="Times New Roman"/>
-          <w:noProof/>
-        </w:rPr>
-        <w:t xml:space="preserve">The SARIMAX will then compare its prediction to the </w:t>
-      </w:r>
-      <w:r>
-        <w:rPr>
-          <w:rFonts w:ascii="Times New Roman" w:hAnsi="Times New Roman" w:cs="Times New Roman"/>
-          <w:noProof/>
-        </w:rPr>
-        <w:t xml:space="preserve">validation data. </w:t>
-      </w:r>
-    </w:p>
-    <w:p>
-      <w:pPr>
-        <w:rPr>
-          <w:rFonts w:ascii="Times New Roman" w:hAnsi="Times New Roman" w:cs="Times New Roman"/>
-          <w:noProof/>
-        </w:rPr>
-      </w:pPr>
-      <w:r>
-        <w:rPr>
-          <w:rFonts w:ascii="Times New Roman" w:hAnsi="Times New Roman" w:cs="Times New Roman"/>
-          <w:noProof/>
-        </w:rPr>
         <w:drawing>
           <wp:inline distT="0" distB="0" distL="0" distR="0" wp14:anchorId="611843D1" wp14:editId="6AB2E936">
             <wp:extent cx="5543550" cy="3510278"/>
@@ -1348,7 +1893,7 @@
                     </pic:cNvPicPr>
                   </pic:nvPicPr>
                   <pic:blipFill>
-                    <a:blip r:embed="rId12">
+                    <a:blip r:embed="rId16">
                       <a:extLst>
                         <a:ext uri="{28A0092B-C50C-407E-A947-70E740481C1C}">
                           <a14:useLocalDpi xmlns:a14="http://schemas.microsoft.com/office/drawing/2010/main" val="0"/>
@@ -1379,6 +1924,7 @@
     </w:p>
     <w:p>
       <w:pPr>
+        <w:spacing w:after="0" w:line="360" w:lineRule="auto"/>
         <w:rPr>
           <w:rFonts w:ascii="Times New Roman" w:hAnsi="Times New Roman" w:cs="Times New Roman"/>
           <w:noProof/>
@@ -1406,7 +1952,7 @@
                     </pic:cNvPicPr>
                   </pic:nvPicPr>
                   <pic:blipFill>
-                    <a:blip r:embed="rId13">
+                    <a:blip r:embed="rId17">
                       <a:extLst>
                         <a:ext uri="{28A0092B-C50C-407E-A947-70E740481C1C}">
                           <a14:useLocalDpi xmlns:a14="http://schemas.microsoft.com/office/drawing/2010/main" val="0"/>
@@ -1440,6 +1986,72 @@
     </w:p>
     <w:p>
       <w:pPr>
+        <w:spacing w:after="0" w:line="360" w:lineRule="auto"/>
+        <w:rPr>
+          <w:rFonts w:ascii="Times New Roman" w:hAnsi="Times New Roman" w:cs="Times New Roman"/>
+          <w:noProof/>
+        </w:rPr>
+      </w:pPr>
+      <w:r>
+        <w:rPr>
+          <w:rFonts w:ascii="Times New Roman" w:hAnsi="Times New Roman" w:cs="Times New Roman"/>
+          <w:noProof/>
+        </w:rPr>
+        <w:t xml:space="preserve">This </w:t>
+      </w:r>
+      <w:r>
+        <w:rPr>
+          <w:rFonts w:ascii="Times New Roman" w:hAnsi="Times New Roman" w:cs="Times New Roman"/>
+          <w:noProof/>
+        </w:rPr>
+        <w:t>was not expected. The adjusted r-squared</w:t>
+      </w:r>
+      <w:r>
+        <w:rPr>
+          <w:rFonts w:ascii="Times New Roman" w:hAnsi="Times New Roman" w:cs="Times New Roman"/>
+          <w:noProof/>
+        </w:rPr>
+        <w:t xml:space="preserve"> </w:t>
+      </w:r>
+      <w:r>
+        <w:rPr>
+          <w:rFonts w:ascii="Times New Roman" w:hAnsi="Times New Roman" w:cs="Times New Roman"/>
+          <w:noProof/>
+        </w:rPr>
+        <w:t xml:space="preserve">is negative and the model does little to explain the previous </w:t>
+      </w:r>
+      <w:r>
+        <w:rPr>
+          <w:rFonts w:ascii="Times New Roman" w:hAnsi="Times New Roman" w:cs="Times New Roman"/>
+          <w:noProof/>
+        </w:rPr>
+        <w:t>twenty years of company data.</w:t>
+      </w:r>
+      <w:r>
+        <w:rPr>
+          <w:rFonts w:ascii="Times New Roman" w:hAnsi="Times New Roman" w:cs="Times New Roman"/>
+          <w:noProof/>
+        </w:rPr>
+        <w:t xml:space="preserve"> A second test was conducted on the data after </w:t>
+      </w:r>
+      <w:r>
+        <w:rPr>
+          <w:rFonts w:ascii="Times New Roman" w:hAnsi="Times New Roman" w:cs="Times New Roman"/>
+          <w:noProof/>
+        </w:rPr>
+        <w:t>COVID, 2021 – 2026</w:t>
+      </w:r>
+      <w:r>
+        <w:rPr>
+          <w:rFonts w:ascii="Times New Roman" w:hAnsi="Times New Roman" w:cs="Times New Roman"/>
+          <w:noProof/>
+        </w:rPr>
+        <w:t xml:space="preserve">. </w:t>
+      </w:r>
+    </w:p>
+    <w:p>
+      <w:pPr>
+        <w:spacing w:after="0" w:line="360" w:lineRule="auto"/>
         <w:rPr>
           <w:rFonts w:ascii="Times New Roman" w:hAnsi="Times New Roman" w:cs="Times New Roman"/>
           <w:noProof/>
@@ -1451,70 +2063,6 @@
           <w:noProof/>
         </w:rPr>
         <w:lastRenderedPageBreak/>
-        <w:t xml:space="preserve">This </w:t>
-      </w:r>
-      <w:r>
-        <w:rPr>
-          <w:rFonts w:ascii="Times New Roman" w:hAnsi="Times New Roman" w:cs="Times New Roman"/>
-          <w:noProof/>
-        </w:rPr>
-        <w:t>was not expected. The adjusted r-squared</w:t>
-      </w:r>
-      <w:r>
-        <w:rPr>
-          <w:rFonts w:ascii="Times New Roman" w:hAnsi="Times New Roman" w:cs="Times New Roman"/>
-          <w:noProof/>
-        </w:rPr>
-        <w:t xml:space="preserve"> </w:t>
-      </w:r>
-      <w:r>
-        <w:rPr>
-          <w:rFonts w:ascii="Times New Roman" w:hAnsi="Times New Roman" w:cs="Times New Roman"/>
-          <w:noProof/>
-        </w:rPr>
-        <w:t xml:space="preserve">is negative and the model does little to explain the previous </w:t>
-      </w:r>
-      <w:r>
-        <w:rPr>
-          <w:rFonts w:ascii="Times New Roman" w:hAnsi="Times New Roman" w:cs="Times New Roman"/>
-          <w:noProof/>
-        </w:rPr>
-        <w:t>twenty years of company data.</w:t>
-      </w:r>
-      <w:r>
-        <w:rPr>
-          <w:rFonts w:ascii="Times New Roman" w:hAnsi="Times New Roman" w:cs="Times New Roman"/>
-          <w:noProof/>
-        </w:rPr>
-        <w:t xml:space="preserve"> A second test was conducted on the data after </w:t>
-      </w:r>
-      <w:r>
-        <w:rPr>
-          <w:rFonts w:ascii="Times New Roman" w:hAnsi="Times New Roman" w:cs="Times New Roman"/>
-          <w:noProof/>
-        </w:rPr>
-        <w:t>COVID, 2021 – 2026</w:t>
-      </w:r>
-      <w:r>
-        <w:rPr>
-          <w:rFonts w:ascii="Times New Roman" w:hAnsi="Times New Roman" w:cs="Times New Roman"/>
-          <w:noProof/>
-        </w:rPr>
-        <w:t xml:space="preserve">. </w:t>
-      </w:r>
-    </w:p>
-    <w:p>
-      <w:pPr>
-        <w:rPr>
-          <w:rFonts w:ascii="Times New Roman" w:hAnsi="Times New Roman" w:cs="Times New Roman"/>
-          <w:noProof/>
-        </w:rPr>
-      </w:pPr>
-      <w:r>
-        <w:rPr>
-          <w:rFonts w:ascii="Times New Roman" w:hAnsi="Times New Roman" w:cs="Times New Roman"/>
-          <w:noProof/>
-        </w:rPr>
         <w:drawing>
           <wp:inline distT="0" distB="0" distL="0" distR="0" wp14:anchorId="4DC72299" wp14:editId="76D600C4">
             <wp:extent cx="4648200" cy="3042187"/>
@@ -1531,7 +2079,7 @@
                     <pic:cNvPicPr/>
                   </pic:nvPicPr>
                   <pic:blipFill>
-                    <a:blip r:embed="rId14"/>
+                    <a:blip r:embed="rId18"/>
                     <a:stretch>
                       <a:fillRect/>
                     </a:stretch>
@@ -1554,6 +2102,7 @@
     </w:p>
     <w:p>
       <w:pPr>
+        <w:spacing w:after="0" w:line="360" w:lineRule="auto"/>
         <w:rPr>
           <w:noProof/>
         </w:rPr>
@@ -1563,9 +2112,17 @@
           <w:noProof/>
         </w:rPr>
         <w:drawing>
-          <wp:inline distT="0" distB="0" distL="0" distR="0" wp14:anchorId="60C26BBB" wp14:editId="14EF86B1">
+          <wp:anchor distT="0" distB="0" distL="114300" distR="114300" simplePos="0" relativeHeight="251658240" behindDoc="0" locked="0" layoutInCell="1" allowOverlap="1" wp14:anchorId="60C26BBB" wp14:editId="3B4F1848">
+            <wp:simplePos x="914400" y="4695825"/>
+            <wp:positionH relativeFrom="column">
+              <wp:align>left</wp:align>
+            </wp:positionH>
+            <wp:positionV relativeFrom="paragraph">
+              <wp:align>top</wp:align>
+            </wp:positionV>
             <wp:extent cx="4505325" cy="3489935"/>
             <wp:effectExtent l="0" t="0" r="0" b="0"/>
+            <wp:wrapSquare wrapText="bothSides"/>
             <wp:docPr id="3" name="Picture 3" descr="A graph with a line graph and numbers&#10;&#10;Description automatically generated with medium confidence"/>
             <wp:cNvGraphicFramePr>
               <a:graphicFrameLocks xmlns:a="http://schemas.openxmlformats.org/drawingml/2006/main" noChangeAspect="1"/>
@@ -1580,7 +2137,7 @@
                     </pic:cNvPicPr>
                   </pic:nvPicPr>
                   <pic:blipFill>
-                    <a:blip r:embed="rId15">
+                    <a:blip r:embed="rId19">
                       <a:extLst>
                         <a:ext uri="{28A0092B-C50C-407E-A947-70E740481C1C}">
                           <a14:useLocalDpi xmlns:a14="http://schemas.microsoft.com/office/drawing/2010/main" val="0"/>
@@ -1595,7 +2152,7 @@
                   <pic:spPr bwMode="auto">
                     <a:xfrm>
                       <a:off x="0" y="0"/>
-                      <a:ext cx="4510974" cy="3494311"/>
+                      <a:ext cx="4505325" cy="3489935"/>
                     </a:xfrm>
                     <a:prstGeom prst="rect">
                       <a:avLst/>
@@ -1608,12 +2165,19 @@
                 </pic:pic>
               </a:graphicData>
             </a:graphic>
-          </wp:inline>
+          </wp:anchor>
         </w:drawing>
       </w:r>
-    </w:p>
-    <w:p>
-      <w:pPr>
+      <w:r>
+        <w:rPr>
+          <w:noProof/>
+        </w:rPr>
+        <w:br w:type="textWrapping" w:clear="all"/>
+      </w:r>
+    </w:p>
+    <w:p>
+      <w:pPr>
+        <w:spacing w:after="0" w:line="360" w:lineRule="auto"/>
         <w:rPr>
           <w:rFonts w:ascii="Times New Roman" w:hAnsi="Times New Roman" w:cs="Times New Roman"/>
         </w:rPr>
@@ -1688,50 +2252,56 @@
         <w:rPr>
           <w:rFonts w:ascii="Times New Roman" w:hAnsi="Times New Roman" w:cs="Times New Roman"/>
         </w:rPr>
+        <w:t xml:space="preserve">allows </w:t>
+      </w:r>
+      <w:r>
+        <w:rPr>
+          <w:rFonts w:ascii="Times New Roman" w:hAnsi="Times New Roman" w:cs="Times New Roman"/>
+        </w:rPr>
+        <w:t xml:space="preserve">consistent variability will be </w:t>
+      </w:r>
+      <w:r>
+        <w:rPr>
+          <w:rFonts w:ascii="Times New Roman" w:hAnsi="Times New Roman" w:cs="Times New Roman"/>
+        </w:rPr>
+        <w:t xml:space="preserve">more </w:t>
+      </w:r>
+      <w:r>
+        <w:rPr>
+          <w:rFonts w:ascii="Times New Roman" w:hAnsi="Times New Roman" w:cs="Times New Roman"/>
+        </w:rPr>
+        <w:t>predictable</w:t>
+      </w:r>
+      <w:r>
+        <w:rPr>
+          <w:rFonts w:ascii="Times New Roman" w:hAnsi="Times New Roman" w:cs="Times New Roman"/>
+        </w:rPr>
+        <w:t xml:space="preserve"> more often. </w:t>
+      </w:r>
+      <w:r>
+        <w:rPr>
+          <w:rFonts w:ascii="Times New Roman" w:hAnsi="Times New Roman" w:cs="Times New Roman"/>
+        </w:rPr>
+        <w:t xml:space="preserve">Isolating the post-COVID </w:t>
+      </w:r>
+      <w:r>
+        <w:rPr>
+          <w:rFonts w:ascii="Times New Roman" w:hAnsi="Times New Roman" w:cs="Times New Roman"/>
+        </w:rPr>
+        <w:t>period</w:t>
+      </w:r>
+      <w:r>
+        <w:rPr>
+          <w:rFonts w:ascii="Times New Roman" w:hAnsi="Times New Roman" w:cs="Times New Roman"/>
+        </w:rPr>
+        <w:t xml:space="preserve"> </w:t>
+      </w:r>
+      <w:r>
+        <w:rPr>
+          <w:rFonts w:ascii="Times New Roman" w:hAnsi="Times New Roman" w:cs="Times New Roman"/>
+        </w:rPr>
         <w:lastRenderedPageBreak/>
-        <w:t xml:space="preserve">allows </w:t>
-      </w:r>
-      <w:r>
-        <w:rPr>
-          <w:rFonts w:ascii="Times New Roman" w:hAnsi="Times New Roman" w:cs="Times New Roman"/>
-        </w:rPr>
-        <w:t xml:space="preserve">consistent variability will be </w:t>
-      </w:r>
-      <w:r>
-        <w:rPr>
-          <w:rFonts w:ascii="Times New Roman" w:hAnsi="Times New Roman" w:cs="Times New Roman"/>
-        </w:rPr>
-        <w:t xml:space="preserve">more </w:t>
-      </w:r>
-      <w:r>
-        <w:rPr>
-          <w:rFonts w:ascii="Times New Roman" w:hAnsi="Times New Roman" w:cs="Times New Roman"/>
-        </w:rPr>
-        <w:t>predictable</w:t>
-      </w:r>
-      <w:r>
-        <w:rPr>
-          <w:rFonts w:ascii="Times New Roman" w:hAnsi="Times New Roman" w:cs="Times New Roman"/>
-        </w:rPr>
-        <w:t xml:space="preserve"> more often. </w:t>
-      </w:r>
-      <w:r>
-        <w:rPr>
-          <w:rFonts w:ascii="Times New Roman" w:hAnsi="Times New Roman" w:cs="Times New Roman"/>
-        </w:rPr>
-        <w:t xml:space="preserve">Isolating the post-COVID </w:t>
-      </w:r>
-      <w:r>
-        <w:rPr>
-          <w:rFonts w:ascii="Times New Roman" w:hAnsi="Times New Roman" w:cs="Times New Roman"/>
-        </w:rPr>
-        <w:t>period</w:t>
-      </w:r>
-      <w:r>
-        <w:rPr>
-          <w:rFonts w:ascii="Times New Roman" w:hAnsi="Times New Roman" w:cs="Times New Roman"/>
-        </w:rPr>
-        <w:t xml:space="preserve"> reduced the observation number drastically, though. </w:t>
+        <w:t xml:space="preserve">reduced the observation number drastically, though. </w:t>
       </w:r>
       <w:r>
         <w:rPr>
@@ -1762,8 +2332,58 @@
 </w:document>
 </file>
 
+<file path=word/endnotes.xml><?xml version="1.0" encoding="utf-8"?>
+<w:endnotes xmlns:wpc="http://schemas.microsoft.com/office/word/2010/wordprocessingCanvas" xmlns:cx="http://schemas.microsoft.com/office/drawing/2014/chartex" xmlns:cx1="http://schemas.microsoft.com/office/drawing/2015/9/8/chartex" xmlns:cx2="http://schemas.microsoft.com/office/drawing/2015/10/21/chartex" xmlns:cx3="http://schemas.microsoft.com/office/drawing/2016/5/9/chartex" xmlns:cx4="http://schemas.microsoft.com/office/drawing/2016/5/10/chartex" xmlns:cx5="http://schemas.microsoft.com/office/drawing/2016/5/11/chartex" xmlns:cx6="http://schemas.microsoft.com/office/drawing/2016/5/12/chartex" xmlns:cx7="http://schemas.microsoft.com/office/drawing/2016/5/13/chartex" xmlns:cx8="http://schemas.microsoft.com/office/drawing/2016/5/14/chartex" xmlns:mc="http://schemas.openxmlformats.org/markup-compatibility/2006" xmlns:aink="http://schemas.microsoft.com/office/drawing/2016/ink" xmlns:am3d="http://schemas.microsoft.com/office/drawing/2017/model3d" xmlns:o="urn:schemas-microsoft-com:office:office" xmlns:oel="http://schemas.microsoft.com/office/2019/extlst" xmlns:r="http://schemas.openxmlformats.org/officeDocument/2006/relationships" xmlns:m="http://schemas.openxmlformats.org/officeDocument/2006/math" xmlns:v="urn:schemas-microsoft-com:vml" xmlns:wp14="http://schemas.microsoft.com/office/word/2010/wordprocessingDrawing" xmlns:wp="http://schemas.openxmlformats.org/drawingml/2006/wordprocessingDrawing" xmlns:w10="urn:schemas-microsoft-com:office:word" xmlns:w="http://schemas.openxmlformats.org/wordprocessingml/2006/main" xmlns:w14="http://schemas.microsoft.com/office/word/2010/wordml" xmlns:w15="http://schemas.microsoft.com/office/word/2012/wordml" xmlns:w16cex="http://schemas.microsoft.com/office/word/2018/wordml/cex" xmlns:w16cid="http://schemas.microsoft.com/office/word/2016/wordml/cid" xmlns:w16="http://schemas.microsoft.com/office/word/2018/wordml" xmlns:w16du="http://schemas.microsoft.com/office/word/2023/wordml/word16du" xmlns:w16sdtdh="http://schemas.microsoft.com/office/word/2020/wordml/sdtdatahash" xmlns:w16se="http://schemas.microsoft.com/office/word/2015/wordml/symex" xmlns:wpg="http://schemas.microsoft.com/office/word/2010/wordprocessingGroup" xmlns:wpi="http://schemas.microsoft.com/office/word/2010/wordprocessingInk" xmlns:wne="http://schemas.microsoft.com/office/word/2006/wordml" xmlns:wps="http://schemas.microsoft.com/office/word/2010/wordprocessingShape" mc:Ignorable="w14 w15 w16se w16cid w16 w16cex w16sdtdh w16du wp14">
+  <w:endnote w:type="separator" w:id="-1">
+    <w:p>
+      <w:pPr>
+        <w:spacing w:after="0" w:line="240" w:lineRule="auto"/>
+      </w:pPr>
+      <w:r>
+        <w:separator/>
+      </w:r>
+    </w:p>
+  </w:endnote>
+  <w:endnote w:type="continuationSeparator" w:id="0">
+    <w:p>
+      <w:pPr>
+        <w:spacing w:after="0" w:line="240" w:lineRule="auto"/>
+      </w:pPr>
+      <w:r>
+        <w:continuationSeparator/>
+      </w:r>
+    </w:p>
+  </w:endnote>
+</w:endnotes>
+</file>
+
+<file path=word/footnotes.xml><?xml version="1.0" encoding="utf-8"?>
+<w:footnotes xmlns:wpc="http://schemas.microsoft.com/office/word/2010/wordprocessingCanvas" xmlns:cx="http://schemas.microsoft.com/office/drawing/2014/chartex" xmlns:cx1="http://schemas.microsoft.com/office/drawing/2015/9/8/chartex" xmlns:cx2="http://schemas.microsoft.com/office/drawing/2015/10/21/chartex" xmlns:cx3="http://schemas.microsoft.com/office/drawing/2016/5/9/chartex" xmlns:cx4="http://schemas.microsoft.com/office/drawing/2016/5/10/chartex" xmlns:cx5="http://schemas.microsoft.com/office/drawing/2016/5/11/chartex" xmlns:cx6="http://schemas.microsoft.com/office/drawing/2016/5/12/chartex" xmlns:cx7="http://schemas.microsoft.com/office/drawing/2016/5/13/chartex" xmlns:cx8="http://schemas.microsoft.com/office/drawing/2016/5/14/chartex" xmlns:mc="http://schemas.openxmlformats.org/markup-compatibility/2006" xmlns:aink="http://schemas.microsoft.com/office/drawing/2016/ink" xmlns:am3d="http://schemas.microsoft.com/office/drawing/2017/model3d" xmlns:o="urn:schemas-microsoft-com:office:office" xmlns:oel="http://schemas.microsoft.com/office/2019/extlst" xmlns:r="http://schemas.openxmlformats.org/officeDocument/2006/relationships" xmlns:m="http://schemas.openxmlformats.org/officeDocument/2006/math" xmlns:v="urn:schemas-microsoft-com:vml" xmlns:wp14="http://schemas.microsoft.com/office/word/2010/wordprocessingDrawing" xmlns:wp="http://schemas.openxmlformats.org/drawingml/2006/wordprocessingDrawing" xmlns:w10="urn:schemas-microsoft-com:office:word" xmlns:w="http://schemas.openxmlformats.org/wordprocessingml/2006/main" xmlns:w14="http://schemas.microsoft.com/office/word/2010/wordml" xmlns:w15="http://schemas.microsoft.com/office/word/2012/wordml" xmlns:w16cex="http://schemas.microsoft.com/office/word/2018/wordml/cex" xmlns:w16cid="http://schemas.microsoft.com/office/word/2016/wordml/cid" xmlns:w16="http://schemas.microsoft.com/office/word/2018/wordml" xmlns:w16du="http://schemas.microsoft.com/office/word/2023/wordml/word16du" xmlns:w16sdtdh="http://schemas.microsoft.com/office/word/2020/wordml/sdtdatahash" xmlns:w16se="http://schemas.microsoft.com/office/word/2015/wordml/symex" xmlns:wpg="http://schemas.microsoft.com/office/word/2010/wordprocessingGroup" xmlns:wpi="http://schemas.microsoft.com/office/word/2010/wordprocessingInk" xmlns:wne="http://schemas.microsoft.com/office/word/2006/wordml" xmlns:wps="http://schemas.microsoft.com/office/word/2010/wordprocessingShape" mc:Ignorable="w14 w15 w16se w16cid w16 w16cex w16sdtdh w16du wp14">
+  <w:footnote w:type="separator" w:id="-1">
+    <w:p>
+      <w:pPr>
+        <w:spacing w:after="0" w:line="240" w:lineRule="auto"/>
+      </w:pPr>
+      <w:r>
+        <w:separator/>
+      </w:r>
+    </w:p>
+  </w:footnote>
+  <w:footnote w:type="continuationSeparator" w:id="0">
+    <w:p>
+      <w:pPr>
+        <w:spacing w:after="0" w:line="240" w:lineRule="auto"/>
+      </w:pPr>
+      <w:r>
+        <w:continuationSeparator/>
+      </w:r>
+    </w:p>
+  </w:footnote>
+</w:footnotes>
+</file>
+
 <file path=word/numbering.xml><?xml version="1.0" encoding="utf-8"?>
-<w:numbering xmlns:wpc="http://schemas.microsoft.com/office/word/2010/wordprocessingCanvas" xmlns:cx="http://schemas.microsoft.com/office/drawing/2014/chartex" xmlns:cx1="http://schemas.microsoft.com/office/drawing/2015/9/8/chartex" xmlns:cx2="http://schemas.microsoft.com/office/drawing/2015/10/21/chartex" xmlns:cx3="http://schemas.microsoft.com/office/drawing/2016/5/9/chartex" xmlns:cx4="http://schemas.microsoft.com/office/drawing/2016/5/10/chartex" xmlns:cx5="http://schemas.microsoft.com/office/drawing/2016/5/11/chartex" xmlns:cx6="http://schemas.microsoft.com/office/drawing/2016/5/12/chartex" xmlns:cx7="http://schemas.microsoft.com/office/drawing/2016/5/13/chartex" xmlns:cx8="http://schemas.microsoft.com/office/drawing/2016/5/14/chartex" xmlns:mc="http://schemas.openxmlformats.org/markup-compatibility/2006" xmlns:aink="http://schemas.microsoft.com/office/drawing/2016/ink" xmlns:am3d="http://schemas.microsoft.com/office/drawing/2017/model3d" xmlns:o="urn:schemas-microsoft-com:office:office" xmlns:oel="http://schemas.microsoft.com/office/2019/extlst" xmlns:r="http://schemas.openxmlformats.org/officeDocument/2006/relationships" xmlns:m="http://schemas.openxmlformats.org/officeDocument/2006/math" xmlns:v="urn:schemas-microsoft-com:vml" xmlns:wp14="http://schemas.microsoft.com/office/word/2010/wordprocessingDrawing" xmlns:wp="http://schemas.openxmlformats.org/drawingml/2006/wordprocessingDrawing" xmlns:w10="urn:schemas-microsoft-com:office:word" xmlns:w="http://schemas.openxmlformats.org/wordprocessingml/2006/main" xmlns:w14="http://schemas.microsoft.com/office/word/2010/wordml" xmlns:w15="http://schemas.microsoft.com/office/word/2012/wordml" xmlns:w16cex="http://schemas.microsoft.com/office/word/2018/wordml/cex" xmlns:w16cid="http://schemas.microsoft.com/office/word/2016/wordml/cid" xmlns:w16="http://schemas.microsoft.com/office/word/2018/wordml" xmlns:w16sdtdh="http://schemas.microsoft.com/office/word/2020/wordml/sdtdatahash" xmlns:w16se="http://schemas.microsoft.com/office/word/2015/wordml/symex" xmlns:wpg="http://schemas.microsoft.com/office/word/2010/wordprocessingGroup" xmlns:wpi="http://schemas.microsoft.com/office/word/2010/wordprocessingInk" xmlns:wne="http://schemas.microsoft.com/office/word/2006/wordml" xmlns:wps="http://schemas.microsoft.com/office/word/2010/wordprocessingShape" mc:Ignorable="w14 w15 w16se w16cid w16 w16cex w16sdtdh wp14">
+<w:numbering xmlns:wpc="http://schemas.microsoft.com/office/word/2010/wordprocessingCanvas" xmlns:cx="http://schemas.microsoft.com/office/drawing/2014/chartex" xmlns:cx1="http://schemas.microsoft.com/office/drawing/2015/9/8/chartex" xmlns:cx2="http://schemas.microsoft.com/office/drawing/2015/10/21/chartex" xmlns:cx3="http://schemas.microsoft.com/office/drawing/2016/5/9/chartex" xmlns:cx4="http://schemas.microsoft.com/office/drawing/2016/5/10/chartex" xmlns:cx5="http://schemas.microsoft.com/office/drawing/2016/5/11/chartex" xmlns:cx6="http://schemas.microsoft.com/office/drawing/2016/5/12/chartex" xmlns:cx7="http://schemas.microsoft.com/office/drawing/2016/5/13/chartex" xmlns:cx8="http://schemas.microsoft.com/office/drawing/2016/5/14/chartex" xmlns:mc="http://schemas.openxmlformats.org/markup-compatibility/2006" xmlns:aink="http://schemas.microsoft.com/office/drawing/2016/ink" xmlns:am3d="http://schemas.microsoft.com/office/drawing/2017/model3d" xmlns:o="urn:schemas-microsoft-com:office:office" xmlns:oel="http://schemas.microsoft.com/office/2019/extlst" xmlns:r="http://schemas.openxmlformats.org/officeDocument/2006/relationships" xmlns:m="http://schemas.openxmlformats.org/officeDocument/2006/math" xmlns:v="urn:schemas-microsoft-com:vml" xmlns:wp14="http://schemas.microsoft.com/office/word/2010/wordprocessingDrawing" xmlns:wp="http://schemas.openxmlformats.org/drawingml/2006/wordprocessingDrawing" xmlns:w10="urn:schemas-microsoft-com:office:word" xmlns:w="http://schemas.openxmlformats.org/wordprocessingml/2006/main" xmlns:w14="http://schemas.microsoft.com/office/word/2010/wordml" xmlns:w15="http://schemas.microsoft.com/office/word/2012/wordml" xmlns:w16cex="http://schemas.microsoft.com/office/word/2018/wordml/cex" xmlns:w16cid="http://schemas.microsoft.com/office/word/2016/wordml/cid" xmlns:w16="http://schemas.microsoft.com/office/word/2018/wordml" xmlns:w16du="http://schemas.microsoft.com/office/word/2023/wordml/word16du" xmlns:w16sdtdh="http://schemas.microsoft.com/office/word/2020/wordml/sdtdatahash" xmlns:w16se="http://schemas.microsoft.com/office/word/2015/wordml/symex" xmlns:wpg="http://schemas.microsoft.com/office/word/2010/wordprocessingGroup" xmlns:wpi="http://schemas.microsoft.com/office/word/2010/wordprocessingInk" xmlns:wne="http://schemas.microsoft.com/office/word/2006/wordml" xmlns:wps="http://schemas.microsoft.com/office/word/2010/wordprocessingShape" mc:Ignorable="w14 w15 w16se w16cid w16 w16cex w16sdtdh w16du wp14">
   <w:abstractNum w:abstractNumId="0" w15:restartNumberingAfterBreak="0">
     <w:nsid w:val="658C7015"/>
     <w:multiLevelType w:val="hybridMultilevel"/>
@@ -1860,7 +2480,7 @@
 </file>
 
 <file path=word/styles.xml><?xml version="1.0" encoding="utf-8"?>
-<w:styles xmlns:mc="http://schemas.openxmlformats.org/markup-compatibility/2006" xmlns:r="http://schemas.openxmlformats.org/officeDocument/2006/relationships" xmlns:w="http://schemas.openxmlformats.org/wordprocessingml/2006/main" xmlns:w14="http://schemas.microsoft.com/office/word/2010/wordml" xmlns:w15="http://schemas.microsoft.com/office/word/2012/wordml" xmlns:w16cex="http://schemas.microsoft.com/office/word/2018/wordml/cex" xmlns:w16cid="http://schemas.microsoft.com/office/word/2016/wordml/cid" xmlns:w16="http://schemas.microsoft.com/office/word/2018/wordml" xmlns:w16sdtdh="http://schemas.microsoft.com/office/word/2020/wordml/sdtdatahash" xmlns:w16se="http://schemas.microsoft.com/office/word/2015/wordml/symex" mc:Ignorable="w14 w15 w16se w16cid w16 w16cex w16sdtdh">
+<w:styles xmlns:mc="http://schemas.openxmlformats.org/markup-compatibility/2006" xmlns:r="http://schemas.openxmlformats.org/officeDocument/2006/relationships" xmlns:w="http://schemas.openxmlformats.org/wordprocessingml/2006/main" xmlns:w14="http://schemas.microsoft.com/office/word/2010/wordml" xmlns:w15="http://schemas.microsoft.com/office/word/2012/wordml" xmlns:w16cex="http://schemas.microsoft.com/office/word/2018/wordml/cex" xmlns:w16cid="http://schemas.microsoft.com/office/word/2016/wordml/cid" xmlns:w16="http://schemas.microsoft.com/office/word/2018/wordml" xmlns:w16du="http://schemas.microsoft.com/office/word/2023/wordml/word16du" xmlns:w16sdtdh="http://schemas.microsoft.com/office/word/2020/wordml/sdtdatahash" xmlns:w16se="http://schemas.microsoft.com/office/word/2015/wordml/symex" mc:Ignorable="w14 w15 w16se w16cid w16 w16cex w16sdtdh w16du">
   <w:docDefaults>
     <w:rPrDefault>
       <w:rPr>
@@ -2260,6 +2880,27 @@
     <w:name w:val="Normal"/>
     <w:qFormat/>
   </w:style>
+  <w:style w:type="paragraph" w:styleId="Heading1">
+    <w:name w:val="heading 1"/>
+    <w:basedOn w:val="Normal"/>
+    <w:next w:val="Normal"/>
+    <w:link w:val="Heading1Char"/>
+    <w:uiPriority w:val="9"/>
+    <w:qFormat/>
+    <w:rsid w:val="00C64CA1"/>
+    <w:pPr>
+      <w:keepNext/>
+      <w:keepLines/>
+      <w:spacing w:before="240" w:after="0"/>
+      <w:outlineLvl w:val="0"/>
+    </w:pPr>
+    <w:rPr>
+      <w:rFonts w:ascii="Times New Roman" w:eastAsiaTheme="majorEastAsia" w:hAnsi="Times New Roman" w:cstheme="majorBidi"/>
+      <w:b/>
+      <w:sz w:val="32"/>
+      <w:szCs w:val="32"/>
+    </w:rPr>
+  </w:style>
   <w:style w:type="character" w:default="1" w:styleId="DefaultParagraphFont">
     <w:name w:val="Default Paragraph Font"/>
     <w:uiPriority w:val="1"/>
@@ -2297,6 +2938,105 @@
       <w:ind w:left="720"/>
       <w:contextualSpacing/>
     </w:pPr>
+  </w:style>
+  <w:style w:type="character" w:customStyle="1" w:styleId="Heading1Char">
+    <w:name w:val="Heading 1 Char"/>
+    <w:basedOn w:val="DefaultParagraphFont"/>
+    <w:link w:val="Heading1"/>
+    <w:uiPriority w:val="9"/>
+    <w:rsid w:val="00C64CA1"/>
+    <w:rPr>
+      <w:rFonts w:ascii="Times New Roman" w:eastAsiaTheme="majorEastAsia" w:hAnsi="Times New Roman" w:cstheme="majorBidi"/>
+      <w:b/>
+      <w:sz w:val="32"/>
+      <w:szCs w:val="32"/>
+    </w:rPr>
+  </w:style>
+  <w:style w:type="paragraph" w:styleId="TOCHeading">
+    <w:name w:val="TOC Heading"/>
+    <w:basedOn w:val="Heading1"/>
+    <w:next w:val="Normal"/>
+    <w:uiPriority w:val="39"/>
+    <w:unhideWhenUsed/>
+    <w:qFormat/>
+    <w:rsid w:val="00886199"/>
+    <w:pPr>
+      <w:outlineLvl w:val="9"/>
+    </w:pPr>
+    <w:rPr>
+      <w:rFonts w:asciiTheme="majorHAnsi" w:hAnsiTheme="majorHAnsi"/>
+      <w:b w:val="0"/>
+      <w:color w:val="2F5496" w:themeColor="accent1" w:themeShade="BF"/>
+      <w:kern w:val="0"/>
+      <w14:ligatures w14:val="none"/>
+    </w:rPr>
+  </w:style>
+  <w:style w:type="paragraph" w:styleId="TOC1">
+    <w:name w:val="toc 1"/>
+    <w:basedOn w:val="Normal"/>
+    <w:next w:val="Normal"/>
+    <w:autoRedefine/>
+    <w:uiPriority w:val="39"/>
+    <w:unhideWhenUsed/>
+    <w:rsid w:val="00886199"/>
+    <w:pPr>
+      <w:spacing w:after="100"/>
+    </w:pPr>
+  </w:style>
+  <w:style w:type="character" w:styleId="Hyperlink">
+    <w:name w:val="Hyperlink"/>
+    <w:basedOn w:val="DefaultParagraphFont"/>
+    <w:uiPriority w:val="99"/>
+    <w:unhideWhenUsed/>
+    <w:rsid w:val="00886199"/>
+    <w:rPr>
+      <w:color w:val="0563C1" w:themeColor="hyperlink"/>
+      <w:u w:val="single"/>
+    </w:rPr>
+  </w:style>
+  <w:style w:type="paragraph" w:styleId="Header">
+    <w:name w:val="header"/>
+    <w:basedOn w:val="Normal"/>
+    <w:link w:val="HeaderChar"/>
+    <w:uiPriority w:val="99"/>
+    <w:unhideWhenUsed/>
+    <w:rsid w:val="00A34422"/>
+    <w:pPr>
+      <w:tabs>
+        <w:tab w:val="center" w:pos="4680"/>
+        <w:tab w:val="right" w:pos="9360"/>
+      </w:tabs>
+      <w:spacing w:after="0" w:line="240" w:lineRule="auto"/>
+    </w:pPr>
+  </w:style>
+  <w:style w:type="character" w:customStyle="1" w:styleId="HeaderChar">
+    <w:name w:val="Header Char"/>
+    <w:basedOn w:val="DefaultParagraphFont"/>
+    <w:link w:val="Header"/>
+    <w:uiPriority w:val="99"/>
+    <w:rsid w:val="00A34422"/>
+  </w:style>
+  <w:style w:type="paragraph" w:styleId="Footer">
+    <w:name w:val="footer"/>
+    <w:basedOn w:val="Normal"/>
+    <w:link w:val="FooterChar"/>
+    <w:uiPriority w:val="99"/>
+    <w:unhideWhenUsed/>
+    <w:rsid w:val="00A34422"/>
+    <w:pPr>
+      <w:tabs>
+        <w:tab w:val="center" w:pos="4680"/>
+        <w:tab w:val="right" w:pos="9360"/>
+      </w:tabs>
+      <w:spacing w:after="0" w:line="240" w:lineRule="auto"/>
+    </w:pPr>
+  </w:style>
+  <w:style w:type="character" w:customStyle="1" w:styleId="FooterChar">
+    <w:name w:val="Footer Char"/>
+    <w:basedOn w:val="DefaultParagraphFont"/>
+    <w:link w:val="Footer"/>
+    <w:uiPriority w:val="99"/>
+    <w:rsid w:val="00A34422"/>
   </w:style>
 </w:styles>
 </file>
@@ -2594,4 +3334,16 @@
     </a:ext>
   </a:extLst>
 </a:theme>
+</file>
+
+<file path=customXml/item1.xml><?xml version="1.0" encoding="utf-8"?>
+<b:Sources xmlns:b="http://schemas.openxmlformats.org/officeDocument/2006/bibliography" xmlns="http://schemas.openxmlformats.org/officeDocument/2006/bibliography" SelectedStyle="\APASixthEditionOfficeOnline.xsl" StyleName="APA" Version="6"/>
+</file>
+
+<file path=customXml/itemProps1.xml><?xml version="1.0" encoding="utf-8"?>
+<ds:datastoreItem xmlns:ds="http://schemas.openxmlformats.org/officeDocument/2006/customXml" ds:itemID="{3E93BBAB-4A9F-4378-9E5C-6B4AE9F99CC6}">
+  <ds:schemaRefs>
+    <ds:schemaRef ds:uri="http://schemas.openxmlformats.org/officeDocument/2006/bibliography"/>
+  </ds:schemaRefs>
+</ds:datastoreItem>
 </file>
</xml_diff>

<commit_message>
Worked on generalizing my notebook and finishing up the report. I still need to design a function that will allow me to verify the validation windows for the SARIMAX model.
</commit_message>
<xml_diff>
--- a/SARIMA Report.docx
+++ b/SARIMA Report.docx
@@ -4,6 +4,14 @@
   <w:body>
     <w:sdt>
       <w:sdtPr>
+        <w:rPr>
+          <w:rFonts w:asciiTheme="minorHAnsi" w:eastAsiaTheme="minorHAnsi" w:hAnsiTheme="minorHAnsi" w:cstheme="minorBidi"/>
+          <w:color w:val="auto"/>
+          <w:kern w:val="2"/>
+          <w:sz w:val="22"/>
+          <w:szCs w:val="22"/>
+          <w14:ligatures w14:val="standardContextual"/>
+        </w:rPr>
         <w:id w:val="452070052"/>
         <w:docPartObj>
           <w:docPartGallery w:val="Table of Contents"/>
@@ -12,15 +20,9 @@
       </w:sdtPr>
       <w:sdtEndPr>
         <w:rPr>
-          <w:rFonts w:asciiTheme="minorHAnsi" w:eastAsiaTheme="minorHAnsi" w:hAnsiTheme="minorHAnsi" w:cstheme="minorBidi"/>
           <w:b/>
           <w:bCs/>
           <w:noProof/>
-          <w:color w:val="auto"/>
-          <w:kern w:val="2"/>
-          <w:sz w:val="22"/>
-          <w:szCs w:val="22"/>
-          <w14:ligatures w14:val="standardContextual"/>
         </w:rPr>
       </w:sdtEndPr>
       <w:sdtContent>
@@ -670,17 +672,15 @@
     </w:p>
     <w:p>
       <w:pPr>
-        <w:spacing w:after="0" w:line="360" w:lineRule="auto"/>
-        <w:rPr>
-          <w:rFonts w:ascii="Times New Roman" w:hAnsi="Times New Roman" w:cs="Times New Roman"/>
-        </w:rPr>
+        <w:keepNext/>
+        <w:spacing w:after="0" w:line="360" w:lineRule="auto"/>
       </w:pPr>
       <w:r>
         <w:rPr>
           <w:noProof/>
         </w:rPr>
         <w:drawing>
-          <wp:inline distT="0" distB="0" distL="0" distR="0" wp14:anchorId="094B7C12" wp14:editId="3FF6FD28">
+          <wp:inline distT="0" distB="0" distL="0" distR="0" wp14:anchorId="094B7C12" wp14:editId="0961954C">
             <wp:extent cx="5943600" cy="2272367"/>
             <wp:effectExtent l="0" t="0" r="0" b="0"/>
             <wp:docPr id="1368298954" name="Picture 1368298954" descr="A graph showing a number of blue lines&#10;&#10;Description automatically generated with medium confidence"/>
@@ -731,9 +731,51 @@
     </w:p>
     <w:p>
       <w:pPr>
+        <w:pStyle w:val="Caption"/>
+        <w:rPr>
+          <w:rFonts w:ascii="Times New Roman" w:hAnsi="Times New Roman" w:cs="Times New Roman"/>
+        </w:rPr>
+      </w:pPr>
+      <w:r>
+        <w:t xml:space="preserve">Figure </w:t>
+      </w:r>
+      <w:r>
+        <w:fldChar w:fldCharType="begin"/>
+      </w:r>
+      <w:r>
+        <w:instrText xml:space="preserve"> SEQ Figure \* ARABIC </w:instrText>
+      </w:r>
+      <w:r>
+        <w:fldChar w:fldCharType="separate"/>
+      </w:r>
+      <w:r>
+        <w:rPr>
+          <w:noProof/>
+        </w:rPr>
+        <w:t>1</w:t>
+      </w:r>
+      <w:r>
+        <w:fldChar w:fldCharType="end"/>
+      </w:r>
+      <w:r>
+        <w:t xml:space="preserve">: </w:t>
+      </w:r>
+      <w:proofErr w:type="spellStart"/>
+      <w:r>
+        <w:t>Mothly</w:t>
+      </w:r>
+      <w:proofErr w:type="spellEnd"/>
+      <w:r>
+        <w:t xml:space="preserve"> Saltwater Disposal since 1998</w:t>
+      </w:r>
+    </w:p>
+    <w:p>
+      <w:pPr>
         <w:spacing w:after="0" w:line="360" w:lineRule="auto"/>
         <w:rPr>
           <w:rStyle w:val="Heading1Char"/>
+          <w:b w:val="0"/>
+          <w:bCs/>
         </w:rPr>
       </w:pPr>
       <w:bookmarkStart w:id="2" w:name="_Toc239743803"/>
@@ -766,6 +808,7 @@
         <w:rPr>
           <w:rFonts w:ascii="Times New Roman" w:hAnsi="Times New Roman" w:cs="Times New Roman"/>
         </w:rPr>
+        <w:lastRenderedPageBreak/>
         <w:t xml:space="preserve">The data is a simple series so the first step in preparing for the model is making sure that the </w:t>
       </w:r>
       <w:r>
@@ -867,9 +910,8 @@
         <w:rPr>
           <w:noProof/>
         </w:rPr>
-        <w:lastRenderedPageBreak/>
         <w:drawing>
-          <wp:inline distT="0" distB="0" distL="0" distR="0" wp14:anchorId="39AD01A9" wp14:editId="3A4F5F02">
+          <wp:inline distT="0" distB="0" distL="0" distR="0" wp14:anchorId="39AD01A9" wp14:editId="7C66A8AB">
             <wp:extent cx="5943600" cy="2285706"/>
             <wp:effectExtent l="0" t="0" r="0" b="635"/>
             <wp:docPr id="2" name="Picture 1" descr="A blue sound wave on a white background&#10;&#10;Description automatically generated"/>
@@ -1126,7 +1168,15 @@
           <w:rFonts w:ascii="Times New Roman" w:hAnsi="Times New Roman" w:cs="Times New Roman"/>
           <w:noProof/>
         </w:rPr>
-        <w:t xml:space="preserve"> up and down. A good insight into how </w:t>
+        <w:t xml:space="preserve"> up and down. A </w:t>
+      </w:r>
+      <w:r>
+        <w:rPr>
+          <w:rFonts w:ascii="Times New Roman" w:hAnsi="Times New Roman" w:cs="Times New Roman"/>
+          <w:noProof/>
+        </w:rPr>
+        <w:lastRenderedPageBreak/>
+        <w:t xml:space="preserve">good insight into how </w:t>
       </w:r>
       <w:r>
         <w:rPr>
@@ -1318,7 +1368,6 @@
           <w:rFonts w:ascii="Times New Roman" w:hAnsi="Times New Roman" w:cs="Times New Roman"/>
           <w:noProof/>
         </w:rPr>
-        <w:lastRenderedPageBreak/>
         <w:drawing>
           <wp:inline distT="0" distB="0" distL="0" distR="0" wp14:anchorId="7B609EF9" wp14:editId="44BFA460">
             <wp:extent cx="4677428" cy="5249008"/>
@@ -1636,7 +1685,6 @@
           <w:rFonts w:ascii="Times New Roman" w:hAnsi="Times New Roman" w:cs="Times New Roman"/>
           <w:noProof/>
         </w:rPr>
-        <w:lastRenderedPageBreak/>
         <w:drawing>
           <wp:inline distT="0" distB="0" distL="0" distR="0" wp14:anchorId="038ED601" wp14:editId="4398909C">
             <wp:extent cx="5645442" cy="2933700"/>
@@ -1874,7 +1922,6 @@
           <w:rFonts w:ascii="Times New Roman" w:hAnsi="Times New Roman" w:cs="Times New Roman"/>
           <w:noProof/>
         </w:rPr>
-        <w:lastRenderedPageBreak/>
         <w:drawing>
           <wp:inline distT="0" distB="0" distL="0" distR="0" wp14:anchorId="611843D1" wp14:editId="6AB2E936">
             <wp:extent cx="5543550" cy="3510278"/>
@@ -2062,7 +2109,6 @@
           <w:rFonts w:ascii="Times New Roman" w:hAnsi="Times New Roman" w:cs="Times New Roman"/>
           <w:noProof/>
         </w:rPr>
-        <w:lastRenderedPageBreak/>
         <w:drawing>
           <wp:inline distT="0" distB="0" distL="0" distR="0" wp14:anchorId="4DC72299" wp14:editId="76D600C4">
             <wp:extent cx="4648200" cy="3042187"/>
@@ -2294,14 +2340,7 @@
         <w:rPr>
           <w:rFonts w:ascii="Times New Roman" w:hAnsi="Times New Roman" w:cs="Times New Roman"/>
         </w:rPr>
-        <w:t xml:space="preserve"> </w:t>
-      </w:r>
-      <w:r>
-        <w:rPr>
-          <w:rFonts w:ascii="Times New Roman" w:hAnsi="Times New Roman" w:cs="Times New Roman"/>
-        </w:rPr>
-        <w:lastRenderedPageBreak/>
-        <w:t xml:space="preserve">reduced the observation number drastically, though. </w:t>
+        <w:t xml:space="preserve"> reduced the observation number drastically, though. </w:t>
       </w:r>
       <w:r>
         <w:rPr>
@@ -3038,6 +3077,25 @@
     <w:uiPriority w:val="99"/>
     <w:rsid w:val="00A34422"/>
   </w:style>
+  <w:style w:type="paragraph" w:styleId="Caption">
+    <w:name w:val="caption"/>
+    <w:basedOn w:val="Normal"/>
+    <w:next w:val="Normal"/>
+    <w:uiPriority w:val="35"/>
+    <w:unhideWhenUsed/>
+    <w:qFormat/>
+    <w:rsid w:val="00CD55B9"/>
+    <w:pPr>
+      <w:spacing w:after="200" w:line="240" w:lineRule="auto"/>
+    </w:pPr>
+    <w:rPr>
+      <w:i/>
+      <w:iCs/>
+      <w:color w:val="44546A" w:themeColor="text2"/>
+      <w:sz w:val="18"/>
+      <w:szCs w:val="18"/>
+    </w:rPr>
+  </w:style>
 </w:styles>
 </file>
 

</xml_diff>